<commit_message>
feat: implementação de geração de PDF em alta fidelidade via HTML e ajuste de margens
- Substituída a renderização do docx-preview por um template HTML pixel-perfect para garantir que o PDF seja idêntico ao DOCX.
- Corrigidas margens de impressão e quebra de conteúdo para caber em uma única página A4.
- Adicionada logo em Base64 para carregamento instantâneo no PDF.
- Fix de hidratação no layout principal.
</commit_message>
<xml_diff>
--- a/public/template.docx
+++ b/public/template.docx
@@ -1,23 +1,14 @@
 
 <file path=word/document.xml><?xml version="1.0" encoding="utf-8"?>
-<w:document xmlns:wpc="http://schemas.microsoft.com/office/word/2010/wordprocessingCanvas" xmlns:cx="http://schemas.microsoft.com/office/drawing/2014/chartex" xmlns:cx1="http://schemas.microsoft.com/office/drawing/2015/9/8/chartex" xmlns:cx2="http://schemas.microsoft.com/office/drawing/2015/10/21/chartex" xmlns:cx3="http://schemas.microsoft.com/office/drawing/2016/5/9/chartex" xmlns:cx4="http://schemas.microsoft.com/office/drawing/2016/5/10/chartex" xmlns:cx5="http://schemas.microsoft.com/office/drawing/2016/5/11/chartex" xmlns:cx6="http://schemas.microsoft.com/office/drawing/2016/5/12/chartex" xmlns:cx7="http://schemas.microsoft.com/office/drawing/2016/5/13/chartex" xmlns:cx8="http://schemas.microsoft.com/office/drawing/2016/5/14/chartex" xmlns:mc="http://schemas.openxmlformats.org/markup-compatibility/2006" xmlns:aink="http://schemas.microsoft.com/office/drawing/2016/ink" xmlns:am3d="http://schemas.microsoft.com/office/drawing/2017/model3d" xmlns:o="urn:schemas-microsoft-com:office:office" xmlns:oel="http://schemas.microsoft.com/office/2019/extlst" xmlns:r="http://schemas.openxmlformats.org/officeDocument/2006/relationships" xmlns:m="http://schemas.openxmlformats.org/officeDocument/2006/math" xmlns:v="urn:schemas-microsoft-com:vml" xmlns:wp14="http://schemas.microsoft.com/office/word/2010/wordprocessingDrawing" xmlns:wp="http://schemas.openxmlformats.org/drawingml/2006/wordprocessingDrawing" xmlns:w10="urn:schemas-microsoft-com:office:word" xmlns:w="http://schemas.openxmlformats.org/wordprocessingml/2006/main" xmlns:w14="http://schemas.microsoft.com/office/word/2010/wordml" xmlns:w15="http://schemas.microsoft.com/office/word/2012/wordml" xmlns:w16cex="http://schemas.microsoft.com/office/word/2018/wordml/cex" xmlns:w16cid="http://schemas.microsoft.com/office/word/2016/wordml/cid" xmlns:w16="http://schemas.microsoft.com/office/word/2018/wordml" xmlns:w16du="http://schemas.microsoft.com/office/word/2023/wordml/word16du" xmlns:w16sdtdh="http://schemas.microsoft.com/office/word/2020/wordml/sdtdatahash" xmlns:w16sdtfl="http://schemas.microsoft.com/office/word/2024/wordml/sdtformatlock" xmlns:w16se="http://schemas.microsoft.com/office/word/2015/wordml/symex" xmlns:wpg="http://schemas.microsoft.com/office/word/2010/wordprocessingGroup" xmlns:wpi="http://schemas.microsoft.com/office/word/2010/wordprocessingInk" xmlns:wne="http://schemas.microsoft.com/office/word/2006/wordml" xmlns:wps="http://schemas.microsoft.com/office/word/2010/wordprocessingShape" xmlns:a="http://schemas.openxmlformats.org/drawingml/2006/main" xmlns:pic="http://schemas.openxmlformats.org/drawingml/2006/picture" xmlns:a14="http://schemas.microsoft.com/office/drawing/2010/main" mc:Ignorable="w14 w15 w16se w16cid w16 w16cex w16sdtdh w16sdtfl w16du wp14">
+<w:document xmlns:wpc="http://schemas.microsoft.com/office/word/2010/wordprocessingCanvas" xmlns:cx="http://schemas.microsoft.com/office/drawing/2014/chartex" xmlns:cx1="http://schemas.microsoft.com/office/drawing/2015/9/8/chartex" xmlns:cx2="http://schemas.microsoft.com/office/drawing/2015/10/21/chartex" xmlns:cx3="http://schemas.microsoft.com/office/drawing/2016/5/9/chartex" xmlns:cx4="http://schemas.microsoft.com/office/drawing/2016/5/10/chartex" xmlns:cx5="http://schemas.microsoft.com/office/drawing/2016/5/11/chartex" xmlns:cx6="http://schemas.microsoft.com/office/drawing/2016/5/12/chartex" xmlns:cx7="http://schemas.microsoft.com/office/drawing/2016/5/13/chartex" xmlns:cx8="http://schemas.microsoft.com/office/drawing/2016/5/14/chartex" xmlns:mc="http://schemas.openxmlformats.org/markup-compatibility/2006" xmlns:aink="http://schemas.microsoft.com/office/drawing/2016/ink" xmlns:am3d="http://schemas.microsoft.com/office/drawing/2017/model3d" xmlns:o="urn:schemas-microsoft-com:office:office" xmlns:oel="http://schemas.microsoft.com/office/2019/extlst" xmlns:r="http://schemas.openxmlformats.org/officeDocument/2006/relationships" xmlns:m="http://schemas.openxmlformats.org/officeDocument/2006/math" xmlns:v="urn:schemas-microsoft-com:vml" xmlns:wp14="http://schemas.microsoft.com/office/word/2010/wordprocessingDrawing" xmlns:wp="http://schemas.openxmlformats.org/drawingml/2006/wordprocessingDrawing" xmlns:w10="urn:schemas-microsoft-com:office:word" xmlns:w="http://schemas.openxmlformats.org/wordprocessingml/2006/main" xmlns:w14="http://schemas.microsoft.com/office/word/2010/wordml" xmlns:w15="http://schemas.microsoft.com/office/word/2012/wordml" xmlns:w16cex="http://schemas.microsoft.com/office/word/2018/wordml/cex" xmlns:w16cid="http://schemas.microsoft.com/office/word/2016/wordml/cid" xmlns:w16="http://schemas.microsoft.com/office/word/2018/wordml" xmlns:w16du="http://schemas.microsoft.com/office/word/2023/wordml/word16du" xmlns:w16sdtdh="http://schemas.microsoft.com/office/word/2020/wordml/sdtdatahash" xmlns:w16sdtfl="http://schemas.microsoft.com/office/word/2024/wordml/sdtformatlock" xmlns:w16se="http://schemas.microsoft.com/office/word/2015/wordml/symex" xmlns:wpg="http://schemas.microsoft.com/office/word/2010/wordprocessingGroup" xmlns:wpi="http://schemas.microsoft.com/office/word/2010/wordprocessingInk" xmlns:wne="http://schemas.microsoft.com/office/word/2006/wordml" xmlns:wps="http://schemas.microsoft.com/office/word/2010/wordprocessingShape" mc:Ignorable="w14 w15 w16se w16cid w16 w16cex w16sdtdh w16sdtfl w16du wp14">
   <w:body>
     <w:p>
       <w:pPr>
-        <w:pStyle w:val="Cabealho"/>
-        <w:spacing w:line="240" w:lineRule="auto"/>
+        <w:pStyle w:val="Header"/>
         <w:jc w:val="right"/>
         <w:rPr>
-          <w:rFonts w:ascii="Aptos Display" w:hAnsi="Aptos Display" w:eastAsia="Aptos Display" w:cs="Aptos Display" w:asciiTheme="majorAscii" w:hAnsiTheme="majorAscii" w:eastAsiaTheme="majorAscii" w:cstheme="majorAscii"/>
-          <w:b w:val="0"/>
-          <w:bCs w:val="0"/>
-          <w:i w:val="0"/>
-          <w:iCs w:val="0"/>
-          <w:caps w:val="0"/>
-          <w:smallCaps w:val="0"/>
-          <w:noProof w:val="0"/>
-          <w:color w:val="000000" w:themeColor="text1" w:themeTint="FF" w:themeShade="FF"/>
-          <w:lang w:val="pt-BR"/>
+          <w:rFonts w:asciiTheme="majorHAnsi" w:eastAsiaTheme="majorEastAsia" w:hAnsiTheme="majorHAnsi" w:cstheme="majorBidi"/>
+          <w:color w:val="000000" w:themeColor="text1"/>
         </w:rPr>
       </w:pPr>
       <w:r>
@@ -41,7 +32,7 @@
               <a:graphicFrameLocks xmlns:a="http://schemas.openxmlformats.org/drawingml/2006/main" noChangeAspect="1"/>
             </wp:cNvGraphicFramePr>
             <a:graphic xmlns:a="http://schemas.openxmlformats.org/drawingml/2006/main">
-              <a:graphicData xmlns:a="http://schemas.openxmlformats.org/drawingml/2006/main" uri="http://schemas.openxmlformats.org/drawingml/2006/picture">
+              <a:graphicData uri="http://schemas.openxmlformats.org/drawingml/2006/picture">
                 <pic:pic xmlns:pic="http://schemas.openxmlformats.org/drawingml/2006/picture">
                   <pic:nvPicPr>
                     <pic:cNvPr id="0" name="Imagem 1" descr="C:\Users\bigteixeira\AppData\Local\Microsoft\Windows\Temporary Internet Files\Content.Word\GOL-Logo-Pref-FundoClaro.png"/>
@@ -50,7 +41,7 @@
                     </pic:cNvPicPr>
                   </pic:nvPicPr>
                   <pic:blipFill>
-                    <a:blip xmlns:r="http://schemas.openxmlformats.org/officeDocument/2006/relationships" r:embed="rId5">
+                    <a:blip r:embed="rId8">
                       <a:extLst>
                         <a:ext uri="{28A0092B-C50C-407E-A947-70E740481C1C}">
                           <a14:useLocalDpi xmlns:a14="http://schemas.microsoft.com/office/drawing/2010/main"/>
@@ -63,7 +54,7 @@
                     </a:stretch>
                   </pic:blipFill>
                   <pic:spPr bwMode="auto">
-                    <a:xfrm rot="0">
+                    <a:xfrm>
                       <a:off x="0" y="0"/>
                       <a:ext cx="1025457" cy="421999"/>
                     </a:xfrm>
@@ -82,67 +73,41 @@
         </w:drawing>
       </w:r>
       <w:r>
-        <w:rPr/>
         <w:t xml:space="preserve">                    </w:t>
       </w:r>
       <w:r>
-        <w:rPr/>
         <w:t xml:space="preserve">              </w:t>
       </w:r>
       <w:r>
-        <w:rPr/>
-        <w:t xml:space="preserve">                                             </w:t>
-      </w:r>
-      <w:r>
-        <w:rPr/>
-        <w:t xml:space="preserve">              </w:t>
+        <w:t xml:space="preserve">                                                           </w:t>
       </w:r>
     </w:p>
     <w:p>
       <w:pPr>
-        <w:pStyle w:val="Cabealho"/>
+        <w:pStyle w:val="Header"/>
         <w:tabs>
-          <w:tab w:val="right" w:leader="none" w:pos="2790"/>
-          <w:tab w:val="center" w:leader="none" w:pos="9000"/>
+          <w:tab w:val="right" w:pos="2790"/>
+          <w:tab w:val="center" w:pos="9000"/>
         </w:tabs>
-        <w:spacing w:line="240" w:lineRule="auto"/>
         <w:jc w:val="right"/>
         <w:rPr>
-          <w:rFonts w:ascii="Aptos Display" w:hAnsi="Aptos Display" w:eastAsia="Aptos Display" w:cs="Aptos Display" w:asciiTheme="majorAscii" w:hAnsiTheme="majorAscii" w:eastAsiaTheme="majorAscii" w:cstheme="majorAscii"/>
-          <w:b w:val="0"/>
-          <w:bCs w:val="0"/>
-          <w:i w:val="0"/>
-          <w:iCs w:val="0"/>
-          <w:caps w:val="0"/>
-          <w:smallCaps w:val="0"/>
-          <w:noProof w:val="0"/>
-          <w:color w:val="000000" w:themeColor="text1" w:themeTint="FF" w:themeShade="FF"/>
-          <w:lang w:val="pt-BR"/>
-        </w:rPr>
-      </w:pPr>
-      <w:r>
-        <w:rPr/>
+          <w:rFonts w:asciiTheme="majorHAnsi" w:eastAsiaTheme="majorEastAsia" w:hAnsiTheme="majorHAnsi" w:cstheme="majorBidi"/>
+          <w:color w:val="000000" w:themeColor="text1"/>
+        </w:rPr>
+      </w:pPr>
+      <w:r>
         <w:t xml:space="preserve"> </w:t>
       </w:r>
     </w:p>
     <w:p>
       <w:pPr>
-        <w:pStyle w:val="Normal"/>
         <w:spacing w:line="276" w:lineRule="auto"/>
         <w:jc w:val="both"/>
         <w:rPr>
-          <w:rFonts w:ascii="Aptos" w:hAnsi="Aptos" w:eastAsia="Aptos" w:cs="Aptos" w:asciiTheme="minorAscii" w:hAnsiTheme="minorAscii" w:eastAsiaTheme="minorAscii" w:cstheme="minorAscii"/>
-          <w:b w:val="0"/>
-          <w:bCs w:val="0"/>
-          <w:i w:val="0"/>
-          <w:iCs w:val="0"/>
-          <w:caps w:val="0"/>
-          <w:smallCaps w:val="0"/>
-          <w:noProof w:val="0"/>
-          <w:color w:val="000000" w:themeColor="text1" w:themeTint="FF" w:themeShade="FF"/>
-          <w:sz w:val="18"/>
-          <w:szCs w:val="18"/>
-          <w:lang w:val="pt-BR"/>
+          <w:rFonts w:asciiTheme="minorHAnsi" w:eastAsiaTheme="minorEastAsia" w:hAnsiTheme="minorHAnsi" w:cstheme="minorBidi"/>
+          <w:color w:val="000000" w:themeColor="text1"/>
+          <w:sz w:val="18"/>
+          <w:szCs w:val="18"/>
         </w:rPr>
       </w:pPr>
       <w:r>
@@ -151,154 +116,85 @@
           <w:sz w:val="16"/>
           <w:szCs w:val="16"/>
         </w:rPr>
-        <w:t xml:space="preserve">                                                                                                                                                                          </w:t>
-      </w:r>
-      <w:r>
-        <w:rPr>
-          <w:rFonts w:ascii="Aptos" w:hAnsi="Aptos" w:eastAsia="Aptos" w:cs="Aptos" w:asciiTheme="minorAscii" w:hAnsiTheme="minorAscii" w:eastAsiaTheme="minorAscii" w:cstheme="minorAscii"/>
-          <w:b w:val="0"/>
-          <w:bCs w:val="0"/>
-          <w:i w:val="0"/>
-          <w:iCs w:val="0"/>
-          <w:caps w:val="0"/>
-          <w:smallCaps w:val="0"/>
-          <w:noProof w:val="0"/>
-          <w:color w:val="000000" w:themeColor="text1" w:themeTint="FF" w:themeShade="FF"/>
-          <w:sz w:val="18"/>
-          <w:szCs w:val="18"/>
-          <w:lang w:val="pt-BR"/>
+        <w:t xml:space="preserve">                                                                                                                    </w:t>
+      </w:r>
+      <w:r>
+        <w:rPr>
+          <w:rFonts w:ascii="Arial" w:hAnsi="Arial" w:cs="Arial"/>
+          <w:sz w:val="16"/>
+          <w:szCs w:val="16"/>
+        </w:rPr>
+        <w:t xml:space="preserve">   </w:t>
+      </w:r>
+      <w:r>
+        <w:rPr>
+          <w:rFonts w:ascii="Arial" w:hAnsi="Arial" w:cs="Arial"/>
+          <w:sz w:val="16"/>
+          <w:szCs w:val="16"/>
+        </w:rPr>
+        <w:t xml:space="preserve">             </w:t>
+      </w:r>
+      <w:r>
+        <w:rPr>
+          <w:rFonts w:asciiTheme="minorHAnsi" w:eastAsiaTheme="minorEastAsia" w:hAnsiTheme="minorHAnsi" w:cstheme="minorBidi"/>
+          <w:color w:val="000000" w:themeColor="text1"/>
+          <w:sz w:val="18"/>
+          <w:szCs w:val="18"/>
         </w:rPr>
         <w:t>GOL Linhas Aéreas S.A.</w:t>
       </w:r>
     </w:p>
-    <w:p w14:noSpellErr="1">
-      <w:pPr>
-        <w:pStyle w:val="Normal"/>
+    <w:p>
+      <w:pPr>
         <w:spacing w:line="276" w:lineRule="auto"/>
         <w:jc w:val="both"/>
         <w:rPr>
-          <w:rFonts w:ascii="Aptos" w:hAnsi="Aptos" w:eastAsia="Aptos" w:cs="Aptos" w:asciiTheme="minorAscii" w:hAnsiTheme="minorAscii" w:eastAsiaTheme="minorAscii" w:cstheme="minorAscii"/>
-          <w:b w:val="0"/>
-          <w:bCs w:val="0"/>
-          <w:i w:val="0"/>
-          <w:iCs w:val="0"/>
-          <w:caps w:val="0"/>
-          <w:smallCaps w:val="0"/>
-          <w:noProof w:val="0"/>
-          <w:color w:val="000000" w:themeColor="text1" w:themeTint="FF" w:themeShade="FF"/>
-          <w:sz w:val="18"/>
-          <w:szCs w:val="18"/>
-          <w:lang w:val="pt-BR"/>
-        </w:rPr>
-      </w:pPr>
-      <w:r>
-        <w:rPr>
-          <w:rFonts w:ascii="Aptos" w:hAnsi="Aptos" w:eastAsia="Aptos" w:cs="Aptos" w:asciiTheme="minorAscii" w:hAnsiTheme="minorAscii" w:eastAsiaTheme="minorAscii" w:cstheme="minorAscii"/>
-          <w:b w:val="0"/>
-          <w:bCs w:val="0"/>
-          <w:i w:val="0"/>
-          <w:iCs w:val="0"/>
-          <w:caps w:val="0"/>
-          <w:smallCaps w:val="0"/>
-          <w:noProof w:val="0"/>
-          <w:color w:val="000000" w:themeColor="text1" w:themeTint="FF" w:themeShade="FF"/>
-          <w:sz w:val="18"/>
-          <w:szCs w:val="18"/>
-          <w:lang w:val="pt-BR"/>
+          <w:rFonts w:asciiTheme="minorHAnsi" w:eastAsiaTheme="minorEastAsia" w:hAnsiTheme="minorHAnsi" w:cstheme="minorBidi"/>
+          <w:color w:val="000000" w:themeColor="text1"/>
+          <w:sz w:val="18"/>
+          <w:szCs w:val="18"/>
+        </w:rPr>
+      </w:pPr>
+      <w:r>
+        <w:rPr>
+          <w:rFonts w:asciiTheme="minorHAnsi" w:eastAsiaTheme="minorEastAsia" w:hAnsiTheme="minorHAnsi" w:cstheme="minorBidi"/>
+          <w:color w:val="000000" w:themeColor="text1"/>
+          <w:sz w:val="18"/>
+          <w:szCs w:val="18"/>
         </w:rPr>
         <w:t xml:space="preserve">                                                                                       </w:t>
       </w:r>
       <w:r>
         <w:rPr>
-          <w:rFonts w:ascii="Aptos" w:hAnsi="Aptos" w:eastAsia="Aptos" w:cs="Aptos" w:asciiTheme="minorAscii" w:hAnsiTheme="minorAscii" w:eastAsiaTheme="minorAscii" w:cstheme="minorAscii"/>
-          <w:b w:val="0"/>
-          <w:bCs w:val="0"/>
-          <w:i w:val="0"/>
-          <w:iCs w:val="0"/>
-          <w:caps w:val="0"/>
-          <w:smallCaps w:val="0"/>
-          <w:noProof w:val="0"/>
-          <w:color w:val="000000" w:themeColor="text1" w:themeTint="FF" w:themeShade="FF"/>
-          <w:sz w:val="18"/>
-          <w:szCs w:val="18"/>
-          <w:lang w:val="pt-BR"/>
+          <w:rFonts w:asciiTheme="minorHAnsi" w:eastAsiaTheme="minorEastAsia" w:hAnsiTheme="minorHAnsi" w:cstheme="minorBidi"/>
+          <w:color w:val="000000" w:themeColor="text1"/>
+          <w:sz w:val="18"/>
+          <w:szCs w:val="18"/>
         </w:rPr>
         <w:t xml:space="preserve">  </w:t>
       </w:r>
       <w:r>
         <w:rPr>
-          <w:rFonts w:ascii="Aptos" w:hAnsi="Aptos" w:eastAsia="Aptos" w:cs="Aptos" w:asciiTheme="minorAscii" w:hAnsiTheme="minorAscii" w:eastAsiaTheme="minorAscii" w:cstheme="minorAscii"/>
-          <w:b w:val="0"/>
-          <w:bCs w:val="0"/>
-          <w:i w:val="0"/>
-          <w:iCs w:val="0"/>
-          <w:caps w:val="0"/>
-          <w:smallCaps w:val="0"/>
-          <w:noProof w:val="0"/>
-          <w:color w:val="000000" w:themeColor="text1" w:themeTint="FF" w:themeShade="FF"/>
-          <w:sz w:val="18"/>
-          <w:szCs w:val="18"/>
-          <w:lang w:val="pt-BR"/>
+          <w:rFonts w:asciiTheme="minorHAnsi" w:eastAsiaTheme="minorEastAsia" w:hAnsiTheme="minorHAnsi" w:cstheme="minorBidi"/>
+          <w:color w:val="000000" w:themeColor="text1"/>
+          <w:sz w:val="18"/>
+          <w:szCs w:val="18"/>
         </w:rPr>
         <w:t xml:space="preserve">                                                                                                      </w:t>
       </w:r>
       <w:r>
         <w:rPr>
-          <w:rFonts w:ascii="Aptos" w:hAnsi="Aptos" w:eastAsia="Aptos" w:cs="Aptos" w:asciiTheme="minorAscii" w:hAnsiTheme="minorAscii" w:eastAsiaTheme="minorAscii" w:cstheme="minorAscii"/>
-          <w:b w:val="0"/>
-          <w:bCs w:val="0"/>
-          <w:i w:val="0"/>
-          <w:iCs w:val="0"/>
-          <w:caps w:val="0"/>
-          <w:smallCaps w:val="0"/>
-          <w:noProof w:val="0"/>
-          <w:color w:val="000000" w:themeColor="text1" w:themeTint="FF" w:themeShade="FF"/>
-          <w:sz w:val="18"/>
-          <w:szCs w:val="18"/>
-          <w:lang w:val="pt-BR"/>
-        </w:rPr>
-        <w:t xml:space="preserve">Praça </w:t>
-      </w:r>
-      <w:r>
-        <w:rPr>
-          <w:rFonts w:ascii="Aptos" w:hAnsi="Aptos" w:eastAsia="Aptos" w:cs="Aptos" w:asciiTheme="minorAscii" w:hAnsiTheme="minorAscii" w:eastAsiaTheme="minorAscii" w:cstheme="minorAscii"/>
-          <w:b w:val="0"/>
-          <w:bCs w:val="0"/>
-          <w:i w:val="0"/>
-          <w:iCs w:val="0"/>
-          <w:caps w:val="0"/>
-          <w:smallCaps w:val="0"/>
-          <w:noProof w:val="0"/>
-          <w:color w:val="000000" w:themeColor="text1" w:themeTint="FF" w:themeShade="FF"/>
-          <w:sz w:val="18"/>
-          <w:szCs w:val="18"/>
-          <w:lang w:val="pt-BR"/>
-        </w:rPr>
-        <w:t>Cmte</w:t>
-      </w:r>
-      <w:r>
-        <w:rPr>
-          <w:rFonts w:ascii="Aptos" w:hAnsi="Aptos" w:eastAsia="Aptos" w:cs="Aptos" w:asciiTheme="minorAscii" w:hAnsiTheme="minorAscii" w:eastAsiaTheme="minorAscii" w:cstheme="minorAscii"/>
-          <w:b w:val="0"/>
-          <w:bCs w:val="0"/>
-          <w:i w:val="0"/>
-          <w:iCs w:val="0"/>
-          <w:caps w:val="0"/>
-          <w:smallCaps w:val="0"/>
-          <w:noProof w:val="0"/>
-          <w:color w:val="000000" w:themeColor="text1" w:themeTint="FF" w:themeShade="FF"/>
-          <w:sz w:val="18"/>
-          <w:szCs w:val="18"/>
-          <w:lang w:val="pt-BR"/>
-        </w:rPr>
-        <w:t xml:space="preserve">. Linneu Gomes, s/nº Portaria 3 </w:t>
+          <w:rFonts w:asciiTheme="minorHAnsi" w:eastAsiaTheme="minorEastAsia" w:hAnsiTheme="minorHAnsi" w:cstheme="minorBidi"/>
+          <w:color w:val="000000" w:themeColor="text1"/>
+          <w:sz w:val="18"/>
+          <w:szCs w:val="18"/>
+        </w:rPr>
+        <w:t xml:space="preserve">Praça Cmte. Linneu Gomes, s/nº Portaria 3 </w:t>
       </w:r>
     </w:p>
     <w:p>
       <w:pPr>
-        <w:pStyle w:val="Normal"/>
         <w:spacing w:line="276" w:lineRule="auto"/>
-        <w:ind w:right="0"/>
         <w:jc w:val="both"/>
         <w:rPr>
           <w:rFonts w:ascii="Arial" w:hAnsi="Arial" w:cs="Arial"/>
@@ -308,265 +204,125 @@
       </w:pPr>
       <w:r>
         <w:rPr>
-          <w:rFonts w:ascii="Aptos" w:hAnsi="Aptos" w:eastAsia="Aptos" w:cs="Aptos" w:asciiTheme="minorAscii" w:hAnsiTheme="minorAscii" w:eastAsiaTheme="minorAscii" w:cstheme="minorAscii"/>
-          <w:b w:val="0"/>
-          <w:bCs w:val="0"/>
-          <w:i w:val="0"/>
-          <w:iCs w:val="0"/>
-          <w:caps w:val="0"/>
-          <w:smallCaps w:val="0"/>
-          <w:noProof w:val="0"/>
-          <w:color w:val="000000" w:themeColor="text1" w:themeTint="FF" w:themeShade="FF"/>
-          <w:sz w:val="18"/>
-          <w:szCs w:val="18"/>
-          <w:lang w:val="pt-BR"/>
+          <w:rFonts w:asciiTheme="minorHAnsi" w:eastAsiaTheme="minorEastAsia" w:hAnsiTheme="minorHAnsi" w:cstheme="minorBidi"/>
+          <w:color w:val="000000" w:themeColor="text1"/>
+          <w:sz w:val="18"/>
+          <w:szCs w:val="18"/>
         </w:rPr>
         <w:t xml:space="preserve">                                                                       </w:t>
       </w:r>
       <w:r>
         <w:rPr>
-          <w:rFonts w:ascii="Aptos" w:hAnsi="Aptos" w:eastAsia="Aptos" w:cs="Aptos" w:asciiTheme="minorAscii" w:hAnsiTheme="minorAscii" w:eastAsiaTheme="minorAscii" w:cstheme="minorAscii"/>
-          <w:b w:val="0"/>
-          <w:bCs w:val="0"/>
-          <w:i w:val="0"/>
-          <w:iCs w:val="0"/>
-          <w:caps w:val="0"/>
-          <w:smallCaps w:val="0"/>
-          <w:noProof w:val="0"/>
-          <w:color w:val="000000" w:themeColor="text1" w:themeTint="FF" w:themeShade="FF"/>
-          <w:sz w:val="18"/>
-          <w:szCs w:val="18"/>
-          <w:lang w:val="pt-BR"/>
+          <w:rFonts w:asciiTheme="minorHAnsi" w:eastAsiaTheme="minorEastAsia" w:hAnsiTheme="minorHAnsi" w:cstheme="minorBidi"/>
+          <w:color w:val="000000" w:themeColor="text1"/>
+          <w:sz w:val="18"/>
+          <w:szCs w:val="18"/>
         </w:rPr>
         <w:t xml:space="preserve">  </w:t>
       </w:r>
       <w:r>
         <w:rPr>
-          <w:rFonts w:ascii="Aptos" w:hAnsi="Aptos" w:eastAsia="Aptos" w:cs="Aptos" w:asciiTheme="minorAscii" w:hAnsiTheme="minorAscii" w:eastAsiaTheme="minorAscii" w:cstheme="minorAscii"/>
-          <w:b w:val="0"/>
-          <w:bCs w:val="0"/>
-          <w:i w:val="0"/>
-          <w:iCs w:val="0"/>
-          <w:caps w:val="0"/>
-          <w:smallCaps w:val="0"/>
-          <w:noProof w:val="0"/>
-          <w:color w:val="000000" w:themeColor="text1" w:themeTint="FF" w:themeShade="FF"/>
-          <w:sz w:val="18"/>
-          <w:szCs w:val="18"/>
-          <w:lang w:val="pt-BR"/>
+          <w:rFonts w:asciiTheme="minorHAnsi" w:eastAsiaTheme="minorEastAsia" w:hAnsiTheme="minorHAnsi" w:cstheme="minorBidi"/>
+          <w:color w:val="000000" w:themeColor="text1"/>
+          <w:sz w:val="18"/>
+          <w:szCs w:val="18"/>
         </w:rPr>
         <w:t xml:space="preserve">            </w:t>
       </w:r>
       <w:r>
         <w:rPr>
-          <w:rFonts w:ascii="Aptos" w:hAnsi="Aptos" w:eastAsia="Aptos" w:cs="Aptos" w:asciiTheme="minorAscii" w:hAnsiTheme="minorAscii" w:eastAsiaTheme="minorAscii" w:cstheme="minorAscii"/>
-          <w:b w:val="0"/>
-          <w:bCs w:val="0"/>
-          <w:i w:val="0"/>
-          <w:iCs w:val="0"/>
-          <w:caps w:val="0"/>
-          <w:smallCaps w:val="0"/>
-          <w:noProof w:val="0"/>
-          <w:color w:val="000000" w:themeColor="text1" w:themeTint="FF" w:themeShade="FF"/>
-          <w:sz w:val="18"/>
-          <w:szCs w:val="18"/>
-          <w:lang w:val="pt-BR"/>
+          <w:rFonts w:asciiTheme="minorHAnsi" w:eastAsiaTheme="minorEastAsia" w:hAnsiTheme="minorHAnsi" w:cstheme="minorBidi"/>
+          <w:color w:val="000000" w:themeColor="text1"/>
+          <w:sz w:val="18"/>
+          <w:szCs w:val="18"/>
         </w:rPr>
         <w:t xml:space="preserve">    </w:t>
       </w:r>
       <w:r>
         <w:rPr>
-          <w:rFonts w:ascii="Aptos" w:hAnsi="Aptos" w:eastAsia="Aptos" w:cs="Aptos" w:asciiTheme="minorAscii" w:hAnsiTheme="minorAscii" w:eastAsiaTheme="minorAscii" w:cstheme="minorAscii"/>
-          <w:b w:val="0"/>
-          <w:bCs w:val="0"/>
-          <w:i w:val="0"/>
-          <w:iCs w:val="0"/>
-          <w:caps w:val="0"/>
-          <w:smallCaps w:val="0"/>
-          <w:noProof w:val="0"/>
-          <w:color w:val="000000" w:themeColor="text1" w:themeTint="FF" w:themeShade="FF"/>
-          <w:sz w:val="18"/>
-          <w:szCs w:val="18"/>
-          <w:lang w:val="pt-BR"/>
+          <w:rFonts w:asciiTheme="minorHAnsi" w:eastAsiaTheme="minorEastAsia" w:hAnsiTheme="minorHAnsi" w:cstheme="minorBidi"/>
+          <w:color w:val="000000" w:themeColor="text1"/>
+          <w:sz w:val="18"/>
+          <w:szCs w:val="18"/>
         </w:rPr>
         <w:t xml:space="preserve"> </w:t>
       </w:r>
       <w:r>
         <w:rPr>
-          <w:rFonts w:ascii="Aptos" w:hAnsi="Aptos" w:eastAsia="Aptos" w:cs="Aptos" w:asciiTheme="minorAscii" w:hAnsiTheme="minorAscii" w:eastAsiaTheme="minorAscii" w:cstheme="minorAscii"/>
-          <w:b w:val="0"/>
-          <w:bCs w:val="0"/>
-          <w:i w:val="0"/>
-          <w:iCs w:val="0"/>
-          <w:caps w:val="0"/>
-          <w:smallCaps w:val="0"/>
-          <w:noProof w:val="0"/>
-          <w:color w:val="000000" w:themeColor="text1" w:themeTint="FF" w:themeShade="FF"/>
-          <w:sz w:val="18"/>
-          <w:szCs w:val="18"/>
-          <w:lang w:val="pt-BR"/>
+          <w:rFonts w:asciiTheme="minorHAnsi" w:eastAsiaTheme="minorEastAsia" w:hAnsiTheme="minorHAnsi" w:cstheme="minorBidi"/>
+          <w:color w:val="000000" w:themeColor="text1"/>
+          <w:sz w:val="18"/>
+          <w:szCs w:val="18"/>
         </w:rPr>
         <w:t xml:space="preserve">                              </w:t>
       </w:r>
       <w:r>
         <w:rPr>
-          <w:rFonts w:ascii="Aptos" w:hAnsi="Aptos" w:eastAsia="Aptos" w:cs="Aptos" w:asciiTheme="minorAscii" w:hAnsiTheme="minorAscii" w:eastAsiaTheme="minorAscii" w:cstheme="minorAscii"/>
-          <w:b w:val="0"/>
-          <w:bCs w:val="0"/>
-          <w:i w:val="0"/>
-          <w:iCs w:val="0"/>
-          <w:caps w:val="0"/>
-          <w:smallCaps w:val="0"/>
-          <w:noProof w:val="0"/>
-          <w:color w:val="000000" w:themeColor="text1" w:themeTint="FF" w:themeShade="FF"/>
-          <w:sz w:val="18"/>
-          <w:szCs w:val="18"/>
-          <w:lang w:val="pt-BR"/>
+          <w:rFonts w:asciiTheme="minorHAnsi" w:eastAsiaTheme="minorEastAsia" w:hAnsiTheme="minorHAnsi" w:cstheme="minorBidi"/>
+          <w:color w:val="000000" w:themeColor="text1"/>
+          <w:sz w:val="18"/>
+          <w:szCs w:val="18"/>
         </w:rPr>
         <w:t xml:space="preserve"> </w:t>
       </w:r>
       <w:r>
         <w:rPr>
-          <w:rFonts w:ascii="Aptos" w:hAnsi="Aptos" w:eastAsia="Aptos" w:cs="Aptos" w:asciiTheme="minorAscii" w:hAnsiTheme="minorAscii" w:eastAsiaTheme="minorAscii" w:cstheme="minorAscii"/>
-          <w:b w:val="0"/>
-          <w:bCs w:val="0"/>
-          <w:i w:val="0"/>
-          <w:iCs w:val="0"/>
-          <w:caps w:val="0"/>
-          <w:smallCaps w:val="0"/>
-          <w:noProof w:val="0"/>
-          <w:color w:val="000000" w:themeColor="text1" w:themeTint="FF" w:themeShade="FF"/>
-          <w:sz w:val="18"/>
-          <w:szCs w:val="18"/>
-          <w:lang w:val="pt-BR"/>
+          <w:rFonts w:asciiTheme="minorHAnsi" w:eastAsiaTheme="minorEastAsia" w:hAnsiTheme="minorHAnsi" w:cstheme="minorBidi"/>
+          <w:color w:val="000000" w:themeColor="text1"/>
+          <w:sz w:val="18"/>
+          <w:szCs w:val="18"/>
         </w:rPr>
         <w:t xml:space="preserve">         </w:t>
       </w:r>
       <w:r>
         <w:rPr>
-          <w:rFonts w:ascii="Aptos" w:hAnsi="Aptos" w:eastAsia="Aptos" w:cs="Aptos" w:asciiTheme="minorAscii" w:hAnsiTheme="minorAscii" w:eastAsiaTheme="minorAscii" w:cstheme="minorAscii"/>
-          <w:b w:val="0"/>
-          <w:bCs w:val="0"/>
-          <w:i w:val="0"/>
-          <w:iCs w:val="0"/>
-          <w:caps w:val="0"/>
-          <w:smallCaps w:val="0"/>
-          <w:noProof w:val="0"/>
-          <w:color w:val="000000" w:themeColor="text1" w:themeTint="FF" w:themeShade="FF"/>
-          <w:sz w:val="18"/>
-          <w:szCs w:val="18"/>
-          <w:lang w:val="pt-BR"/>
+          <w:rFonts w:asciiTheme="minorHAnsi" w:eastAsiaTheme="minorEastAsia" w:hAnsiTheme="minorHAnsi" w:cstheme="minorBidi"/>
+          <w:color w:val="000000" w:themeColor="text1"/>
+          <w:sz w:val="18"/>
+          <w:szCs w:val="18"/>
         </w:rPr>
         <w:t xml:space="preserve"> </w:t>
       </w:r>
       <w:r>
         <w:rPr>
-          <w:rFonts w:ascii="Aptos" w:hAnsi="Aptos" w:eastAsia="Aptos" w:cs="Aptos" w:asciiTheme="minorAscii" w:hAnsiTheme="minorAscii" w:eastAsiaTheme="minorAscii" w:cstheme="minorAscii"/>
-          <w:b w:val="0"/>
-          <w:bCs w:val="0"/>
-          <w:i w:val="0"/>
-          <w:iCs w:val="0"/>
-          <w:caps w:val="0"/>
-          <w:smallCaps w:val="0"/>
-          <w:noProof w:val="0"/>
-          <w:color w:val="000000" w:themeColor="text1" w:themeTint="FF" w:themeShade="FF"/>
-          <w:sz w:val="18"/>
-          <w:szCs w:val="18"/>
-          <w:lang w:val="pt-BR"/>
-        </w:rPr>
-        <w:t xml:space="preserve">                             </w:t>
-      </w:r>
-      <w:r>
-        <w:rPr>
-          <w:rFonts w:ascii="Aptos" w:hAnsi="Aptos" w:eastAsia="Aptos" w:cs="Aptos" w:asciiTheme="minorAscii" w:hAnsiTheme="minorAscii" w:eastAsiaTheme="minorAscii" w:cstheme="minorAscii"/>
-          <w:b w:val="0"/>
-          <w:bCs w:val="0"/>
-          <w:i w:val="0"/>
-          <w:iCs w:val="0"/>
-          <w:caps w:val="0"/>
-          <w:smallCaps w:val="0"/>
-          <w:noProof w:val="0"/>
-          <w:color w:val="000000" w:themeColor="text1" w:themeTint="FF" w:themeShade="FF"/>
-          <w:sz w:val="18"/>
-          <w:szCs w:val="18"/>
-          <w:lang w:val="pt-BR"/>
+          <w:rFonts w:asciiTheme="minorHAnsi" w:eastAsiaTheme="minorEastAsia" w:hAnsiTheme="minorHAnsi" w:cstheme="minorBidi"/>
+          <w:color w:val="000000" w:themeColor="text1"/>
+          <w:sz w:val="18"/>
+          <w:szCs w:val="18"/>
+        </w:rPr>
+        <w:t xml:space="preserve">                              </w:t>
+      </w:r>
+      <w:r>
+        <w:rPr>
+          <w:rFonts w:asciiTheme="minorHAnsi" w:eastAsiaTheme="minorEastAsia" w:hAnsiTheme="minorHAnsi" w:cstheme="minorBidi"/>
+          <w:color w:val="000000" w:themeColor="text1"/>
+          <w:sz w:val="18"/>
+          <w:szCs w:val="18"/>
+        </w:rPr>
+        <w:t xml:space="preserve">                                       </w:t>
+      </w:r>
+      <w:r>
+        <w:rPr>
+          <w:rFonts w:asciiTheme="minorHAnsi" w:eastAsiaTheme="minorEastAsia" w:hAnsiTheme="minorHAnsi" w:cstheme="minorBidi"/>
+          <w:color w:val="000000" w:themeColor="text1"/>
+          <w:sz w:val="18"/>
+          <w:szCs w:val="18"/>
         </w:rPr>
         <w:t xml:space="preserve"> </w:t>
       </w:r>
       <w:r>
         <w:rPr>
-          <w:rFonts w:ascii="Aptos" w:hAnsi="Aptos" w:eastAsia="Aptos" w:cs="Aptos" w:asciiTheme="minorAscii" w:hAnsiTheme="minorAscii" w:eastAsiaTheme="minorAscii" w:cstheme="minorAscii"/>
-          <w:b w:val="0"/>
-          <w:bCs w:val="0"/>
-          <w:i w:val="0"/>
-          <w:iCs w:val="0"/>
-          <w:caps w:val="0"/>
-          <w:smallCaps w:val="0"/>
-          <w:noProof w:val="0"/>
-          <w:color w:val="000000" w:themeColor="text1" w:themeTint="FF" w:themeShade="FF"/>
-          <w:sz w:val="18"/>
-          <w:szCs w:val="18"/>
-          <w:lang w:val="pt-BR"/>
-        </w:rPr>
-        <w:t xml:space="preserve">                                       </w:t>
-      </w:r>
-      <w:r>
-        <w:rPr>
-          <w:rFonts w:ascii="Aptos" w:hAnsi="Aptos" w:eastAsia="Aptos" w:cs="Aptos" w:asciiTheme="minorAscii" w:hAnsiTheme="minorAscii" w:eastAsiaTheme="minorAscii" w:cstheme="minorAscii"/>
-          <w:b w:val="0"/>
-          <w:bCs w:val="0"/>
-          <w:i w:val="0"/>
-          <w:iCs w:val="0"/>
-          <w:caps w:val="0"/>
-          <w:smallCaps w:val="0"/>
-          <w:noProof w:val="0"/>
-          <w:color w:val="000000" w:themeColor="text1" w:themeTint="FF" w:themeShade="FF"/>
-          <w:sz w:val="18"/>
-          <w:szCs w:val="18"/>
-          <w:lang w:val="pt-BR"/>
-        </w:rPr>
-        <w:t xml:space="preserve"> </w:t>
-      </w:r>
-      <w:r>
-        <w:rPr>
-          <w:rFonts w:ascii="Aptos" w:hAnsi="Aptos" w:eastAsia="Aptos" w:cs="Aptos" w:asciiTheme="minorAscii" w:hAnsiTheme="minorAscii" w:eastAsiaTheme="minorAscii" w:cstheme="minorAscii"/>
-          <w:b w:val="0"/>
-          <w:bCs w:val="0"/>
-          <w:i w:val="0"/>
-          <w:iCs w:val="0"/>
-          <w:caps w:val="0"/>
-          <w:smallCaps w:val="0"/>
-          <w:noProof w:val="0"/>
-          <w:color w:val="000000" w:themeColor="text1" w:themeTint="FF" w:themeShade="FF"/>
-          <w:sz w:val="18"/>
-          <w:szCs w:val="18"/>
-          <w:lang w:val="pt-BR"/>
-        </w:rPr>
-        <w:t>J</w:t>
-      </w:r>
-      <w:r>
-        <w:rPr>
-          <w:rFonts w:ascii="Aptos" w:hAnsi="Aptos" w:eastAsia="Aptos" w:cs="Aptos" w:asciiTheme="minorAscii" w:hAnsiTheme="minorAscii" w:eastAsiaTheme="minorAscii" w:cstheme="minorAscii"/>
-          <w:b w:val="0"/>
-          <w:bCs w:val="0"/>
-          <w:i w:val="0"/>
-          <w:iCs w:val="0"/>
-          <w:caps w:val="0"/>
-          <w:smallCaps w:val="0"/>
-          <w:noProof w:val="0"/>
-          <w:color w:val="000000" w:themeColor="text1" w:themeTint="FF" w:themeShade="FF"/>
-          <w:sz w:val="18"/>
-          <w:szCs w:val="18"/>
-          <w:lang w:val="pt-BR"/>
-        </w:rPr>
-        <w:t>ardim Aeroporto CEP 04626-020</w:t>
+          <w:rFonts w:asciiTheme="minorHAnsi" w:eastAsiaTheme="minorEastAsia" w:hAnsiTheme="minorHAnsi" w:cstheme="minorBidi"/>
+          <w:color w:val="000000" w:themeColor="text1"/>
+          <w:sz w:val="18"/>
+          <w:szCs w:val="18"/>
+        </w:rPr>
+        <w:t>Jardim Aeroporto CEP 04626-020</w:t>
       </w:r>
     </w:p>
     <w:p>
       <w:pPr>
-        <w:pStyle w:val="Normal"/>
         <w:spacing w:line="276" w:lineRule="auto"/>
-        <w:ind w:right="0"/>
         <w:jc w:val="both"/>
         <w:rPr>
           <w:rFonts w:ascii="Arial" w:hAnsi="Arial" w:cs="Arial"/>
@@ -576,86 +332,45 @@
       </w:pPr>
       <w:r>
         <w:rPr>
-          <w:rFonts w:ascii="Aptos" w:hAnsi="Aptos" w:eastAsia="Aptos" w:cs="Aptos" w:asciiTheme="minorAscii" w:hAnsiTheme="minorAscii" w:eastAsiaTheme="minorAscii" w:cstheme="minorAscii"/>
-          <w:b w:val="0"/>
-          <w:bCs w:val="0"/>
-          <w:i w:val="0"/>
-          <w:iCs w:val="0"/>
-          <w:caps w:val="0"/>
-          <w:smallCaps w:val="0"/>
-          <w:noProof w:val="0"/>
-          <w:color w:val="000000" w:themeColor="text1" w:themeTint="FF" w:themeShade="FF"/>
-          <w:sz w:val="18"/>
-          <w:szCs w:val="18"/>
-          <w:lang w:val="pt-BR"/>
+          <w:rFonts w:asciiTheme="minorHAnsi" w:eastAsiaTheme="minorEastAsia" w:hAnsiTheme="minorHAnsi" w:cstheme="minorBidi"/>
+          <w:color w:val="000000" w:themeColor="text1"/>
+          <w:sz w:val="18"/>
+          <w:szCs w:val="18"/>
         </w:rPr>
         <w:t xml:space="preserve"> </w:t>
       </w:r>
       <w:r>
         <w:rPr>
-          <w:rFonts w:ascii="Aptos" w:hAnsi="Aptos" w:eastAsia="Aptos" w:cs="Aptos" w:asciiTheme="minorAscii" w:hAnsiTheme="minorAscii" w:eastAsiaTheme="minorAscii" w:cstheme="minorAscii"/>
-          <w:b w:val="0"/>
-          <w:bCs w:val="0"/>
-          <w:i w:val="0"/>
-          <w:iCs w:val="0"/>
-          <w:caps w:val="0"/>
-          <w:smallCaps w:val="0"/>
-          <w:noProof w:val="0"/>
-          <w:color w:val="000000" w:themeColor="text1" w:themeTint="FF" w:themeShade="FF"/>
-          <w:sz w:val="18"/>
-          <w:szCs w:val="18"/>
-          <w:lang w:val="pt-BR"/>
+          <w:rFonts w:asciiTheme="minorHAnsi" w:eastAsiaTheme="minorEastAsia" w:hAnsiTheme="minorHAnsi" w:cstheme="minorBidi"/>
+          <w:color w:val="000000" w:themeColor="text1"/>
+          <w:sz w:val="18"/>
+          <w:szCs w:val="18"/>
         </w:rPr>
         <w:t xml:space="preserve">  </w:t>
       </w:r>
       <w:r>
         <w:rPr>
-          <w:rFonts w:ascii="Aptos" w:hAnsi="Aptos" w:eastAsia="Aptos" w:cs="Aptos" w:asciiTheme="minorAscii" w:hAnsiTheme="minorAscii" w:eastAsiaTheme="minorAscii" w:cstheme="minorAscii"/>
-          <w:b w:val="0"/>
-          <w:bCs w:val="0"/>
-          <w:i w:val="0"/>
-          <w:iCs w:val="0"/>
-          <w:caps w:val="0"/>
-          <w:smallCaps w:val="0"/>
-          <w:noProof w:val="0"/>
-          <w:color w:val="000000" w:themeColor="text1" w:themeTint="FF" w:themeShade="FF"/>
-          <w:sz w:val="18"/>
-          <w:szCs w:val="18"/>
-          <w:lang w:val="pt-BR"/>
+          <w:rFonts w:asciiTheme="minorHAnsi" w:eastAsiaTheme="minorEastAsia" w:hAnsiTheme="minorHAnsi" w:cstheme="minorBidi"/>
+          <w:color w:val="000000" w:themeColor="text1"/>
+          <w:sz w:val="18"/>
+          <w:szCs w:val="18"/>
         </w:rPr>
         <w:t xml:space="preserve">                                                                                                                                                                                                                    </w:t>
       </w:r>
       <w:r>
         <w:rPr>
-          <w:rFonts w:ascii="Aptos" w:hAnsi="Aptos" w:eastAsia="Aptos" w:cs="Aptos" w:asciiTheme="minorAscii" w:hAnsiTheme="minorAscii" w:eastAsiaTheme="minorAscii" w:cstheme="minorAscii"/>
-          <w:b w:val="0"/>
-          <w:bCs w:val="0"/>
-          <w:i w:val="0"/>
-          <w:iCs w:val="0"/>
-          <w:caps w:val="0"/>
-          <w:smallCaps w:val="0"/>
-          <w:noProof w:val="0"/>
-          <w:color w:val="000000" w:themeColor="text1" w:themeTint="FF" w:themeShade="FF"/>
-          <w:sz w:val="18"/>
-          <w:szCs w:val="18"/>
-          <w:lang w:val="pt-BR"/>
+          <w:rFonts w:asciiTheme="minorHAnsi" w:eastAsiaTheme="minorEastAsia" w:hAnsiTheme="minorHAnsi" w:cstheme="minorBidi"/>
+          <w:color w:val="000000" w:themeColor="text1"/>
+          <w:sz w:val="18"/>
+          <w:szCs w:val="18"/>
         </w:rPr>
         <w:t>São Paulo/S</w:t>
       </w:r>
       <w:r>
         <w:rPr>
-          <w:rFonts w:ascii="Times New Roman" w:hAnsi="Times New Roman" w:eastAsia="Times New Roman" w:cs="Times New Roman"/>
-          <w:b w:val="0"/>
-          <w:bCs w:val="0"/>
-          <w:i w:val="0"/>
-          <w:iCs w:val="0"/>
-          <w:caps w:val="0"/>
-          <w:smallCaps w:val="0"/>
-          <w:noProof w:val="0"/>
-          <w:color w:val="000000" w:themeColor="text1" w:themeTint="FF" w:themeShade="FF"/>
+          <w:color w:val="000000" w:themeColor="text1"/>
           <w:sz w:val="16"/>
           <w:szCs w:val="16"/>
-          <w:lang w:val="pt-BR"/>
         </w:rPr>
         <w:t>P</w:t>
       </w:r>
@@ -670,15 +385,12 @@
     </w:p>
     <w:p>
       <w:pPr>
-        <w:pStyle w:val="Normal"/>
         <w:spacing w:line="360" w:lineRule="auto"/>
         <w:jc w:val="both"/>
         <w:rPr>
-          <w:rFonts w:ascii="Arial" w:hAnsi="Arial" w:eastAsia="Arial" w:cs="Arial"/>
-          <w:noProof w:val="0"/>
-          <w:sz w:val="28"/>
-          <w:szCs w:val="28"/>
-          <w:lang w:val="pt-BR"/>
+          <w:rFonts w:ascii="Arial" w:eastAsia="Arial" w:hAnsi="Arial" w:cs="Arial"/>
+          <w:sz w:val="18"/>
+          <w:szCs w:val="18"/>
         </w:rPr>
       </w:pPr>
       <w:r>
@@ -692,43 +404,35 @@
       <w:r>
         <w:rPr>
           <w:rFonts w:ascii="Arial" w:hAnsi="Arial" w:cs="Arial"/>
-          <w:b w:val="1"/>
-          <w:bCs w:val="1"/>
-          <w:color w:val="auto"/>
-          <w:sz w:val="28"/>
-          <w:szCs w:val="28"/>
+          <w:b/>
+          <w:bCs/>
+          <w:sz w:val="18"/>
+          <w:szCs w:val="18"/>
         </w:rPr>
         <w:t xml:space="preserve"> </w:t>
       </w:r>
       <w:r>
         <w:rPr>
-          <w:rFonts w:ascii="Arial" w:hAnsi="Arial" w:eastAsia="Arial" w:cs="Arial"/>
-          <w:b w:val="0"/>
-          <w:bCs w:val="0"/>
-          <w:i w:val="0"/>
-          <w:iCs w:val="0"/>
-          <w:caps w:val="0"/>
-          <w:smallCaps w:val="0"/>
-          <w:noProof w:val="0"/>
+          <w:rFonts w:ascii="Arial" w:eastAsia="Arial" w:hAnsi="Arial" w:cs="Arial"/>
+          <w:b/>
+          <w:bCs/>
           <w:color w:val="333333"/>
-          <w:sz w:val="24"/>
-          <w:szCs w:val="24"/>
-          <w:lang w:val="pt-BR"/>
-        </w:rPr>
-        <w:t>{CODIGO_LOCALIZADOR}</w:t>
+          <w:sz w:val="18"/>
+          <w:szCs w:val="18"/>
+        </w:rPr>
+        <w:t>SISBSU</w:t>
       </w:r>
     </w:p>
     <w:p>
       <w:pPr>
-        <w:pStyle w:val="Normal"/>
         <w:spacing w:line="360" w:lineRule="auto"/>
         <w:jc w:val="both"/>
         <w:rPr>
-          <w:rFonts w:ascii="Arial" w:hAnsi="Arial" w:eastAsia="Arial" w:cs="Arial"/>
-          <w:noProof w:val="0"/>
-          <w:sz w:val="18"/>
-          <w:szCs w:val="18"/>
-          <w:lang w:val="pt-BR"/>
+          <w:rFonts w:ascii="Arial" w:eastAsia="Arial" w:hAnsi="Arial" w:cs="Arial"/>
+          <w:b/>
+          <w:bCs/>
+          <w:sz w:val="18"/>
+          <w:szCs w:val="18"/>
         </w:rPr>
       </w:pPr>
       <w:r>
@@ -741,51 +445,35 @@
       </w:r>
       <w:r>
         <w:rPr>
-          <w:rFonts w:ascii="Arial" w:hAnsi="Arial" w:eastAsia="Arial" w:cs="Arial"/>
-          <w:b w:val="0"/>
-          <w:bCs w:val="0"/>
-          <w:i w:val="0"/>
-          <w:iCs w:val="0"/>
-          <w:caps w:val="0"/>
-          <w:smallCaps w:val="0"/>
-          <w:noProof w:val="0"/>
+          <w:rFonts w:ascii="Arial" w:eastAsia="Arial" w:hAnsi="Arial" w:cs="Arial"/>
+          <w:b/>
+          <w:bCs/>
           <w:color w:val="333333"/>
-          <w:sz w:val="24"/>
-          <w:szCs w:val="24"/>
-          <w:lang w:val="pt-BR"/>
-        </w:rPr>
-        <w:t>{RELATORIO_DANO}</w:t>
+          <w:sz w:val="18"/>
+          <w:szCs w:val="18"/>
+        </w:rPr>
+        <w:t>POAG360019</w:t>
       </w:r>
     </w:p>
     <w:p>
       <w:pPr>
-        <w:pStyle w:val="Corpodetexto2"/>
+        <w:pStyle w:val="BodyText2"/>
         <w:spacing w:line="360" w:lineRule="auto"/>
         <w:ind w:left="-45"/>
         <w:jc w:val="both"/>
         <w:rPr>
           <w:rFonts w:ascii="Arial" w:hAnsi="Arial" w:cs="Arial"/>
-          <w:b w:val="0"/>
-          <w:bCs w:val="0"/>
-          <w:sz w:val="18"/>
-          <w:szCs w:val="18"/>
-        </w:rPr>
-      </w:pPr>
-      <w:r>
-        <w:rPr>
-          <w:rFonts w:ascii="Arial" w:hAnsi="Arial" w:cs="Arial"/>
-          <w:sz w:val="18"/>
-          <w:szCs w:val="18"/>
-        </w:rPr>
-        <w:t>De um lado GOL</w:t>
-      </w:r>
-      <w:r>
-        <w:rPr>
-          <w:rFonts w:ascii="Arial" w:hAnsi="Arial" w:cs="Arial"/>
-          <w:sz w:val="18"/>
-          <w:szCs w:val="18"/>
-        </w:rPr>
-        <w:t xml:space="preserve"> LINHAS AÉREAS S.A., empresa com sede na Avenida Vinte de Janeiro, terminal de passageiros n°. 1 do Aeroporto Internacional do Rio de Janeiro / Galeão /, Antônio Carlos Jobim, 2ºandar, nível 15,55 entre os eixos 10-12/E-G, sala 2011-A, Embarque, CEP </w:t>
+          <w:sz w:val="18"/>
+          <w:szCs w:val="18"/>
+        </w:rPr>
+      </w:pPr>
+      <w:r>
+        <w:rPr>
+          <w:rFonts w:ascii="Arial" w:hAnsi="Arial" w:cs="Arial"/>
+          <w:sz w:val="18"/>
+          <w:szCs w:val="18"/>
+        </w:rPr>
+        <w:t xml:space="preserve">De um lado GOL LINHAS AÉREAS S.A., empresa com sede na Avenida Vinte de Janeiro, terminal de passageiros n°. 1 do Aeroporto Internacional do Rio de Janeiro / Galeão /, Antônio Carlos Jobim, 2ºandar, nível 15,55 entre os eixos 10-12/E-G, sala 2011-A, Embarque, CEP </w:t>
       </w:r>
       <w:r>
         <w:rPr>
@@ -806,8 +494,6 @@
       <w:r>
         <w:rPr>
           <w:rFonts w:ascii="Arial" w:hAnsi="Arial" w:cs="Arial"/>
-          <w:b w:val="0"/>
-          <w:bCs w:val="0"/>
           <w:sz w:val="18"/>
           <w:szCs w:val="18"/>
         </w:rPr>
@@ -815,45 +501,31 @@
       </w:r>
       <w:r>
         <w:rPr>
-          <w:rFonts w:ascii="Arial" w:hAnsi="Arial" w:eastAsia="Arial" w:cs="Arial"/>
-          <w:b w:val="0"/>
-          <w:bCs w:val="0"/>
-          <w:i w:val="0"/>
-          <w:iCs w:val="0"/>
-          <w:caps w:val="0"/>
-          <w:smallCaps w:val="0"/>
-          <w:noProof w:val="0"/>
+          <w:rFonts w:ascii="Arial" w:eastAsia="Arial" w:hAnsi="Arial" w:cs="Arial"/>
           <w:color w:val="333333"/>
-          <w:sz w:val="24"/>
-          <w:szCs w:val="24"/>
-          <w:lang w:val="pt-BR"/>
+          <w:sz w:val="18"/>
+          <w:szCs w:val="18"/>
         </w:rPr>
         <w:t xml:space="preserve"> </w:t>
       </w:r>
       <w:r>
         <w:rPr>
-          <w:rFonts w:ascii="Arial" w:hAnsi="Arial" w:eastAsia="Arial" w:cs="Arial"/>
-          <w:b w:val="0"/>
-          <w:bCs w:val="0"/>
-          <w:i w:val="0"/>
-          <w:iCs w:val="0"/>
-          <w:caps w:val="0"/>
-          <w:smallCaps w:val="0"/>
-          <w:noProof w:val="0"/>
+          <w:rFonts w:ascii="Arial" w:eastAsia="Arial" w:hAnsi="Arial" w:cs="Arial"/>
+          <w:b/>
+          <w:bCs/>
           <w:color w:val="333333"/>
-          <w:sz w:val="24"/>
-          <w:szCs w:val="24"/>
-          <w:lang w:val="pt-BR"/>
-        </w:rPr>
-        <w:t>{NOME_CLIENTE}</w:t>
-      </w:r>
-      <w:r>
-        <w:rPr>
-          <w:rFonts w:ascii="Arial" w:hAnsi="Arial" w:cs="Arial"/>
-          <w:b w:val="1"/>
-          <w:bCs w:val="1"/>
-          <w:sz w:val="20"/>
-          <w:szCs w:val="20"/>
+          <w:sz w:val="18"/>
+          <w:szCs w:val="18"/>
+        </w:rPr>
+        <w:t>JULIANA ALMEIDA</w:t>
+      </w:r>
+      <w:r>
+        <w:rPr>
+          <w:rFonts w:ascii="Arial" w:hAnsi="Arial" w:cs="Arial"/>
+          <w:b/>
+          <w:bCs/>
+          <w:sz w:val="18"/>
+          <w:szCs w:val="18"/>
         </w:rPr>
         <w:t xml:space="preserve"> </w:t>
       </w:r>
@@ -863,37 +535,23 @@
           <w:sz w:val="18"/>
           <w:szCs w:val="18"/>
         </w:rPr>
-        <w:t>portador</w:t>
-      </w:r>
-      <w:r>
-        <w:rPr>
-          <w:rFonts w:ascii="Arial" w:hAnsi="Arial" w:cs="Arial"/>
-          <w:sz w:val="18"/>
-          <w:szCs w:val="18"/>
-        </w:rPr>
-        <w:t xml:space="preserve"> do CPF nº </w:t>
-      </w:r>
-      <w:r>
-        <w:rPr>
-          <w:rFonts w:ascii="Arial" w:hAnsi="Arial" w:eastAsia="Arial" w:cs="Arial"/>
-          <w:b w:val="0"/>
-          <w:bCs w:val="0"/>
-          <w:i w:val="0"/>
-          <w:iCs w:val="0"/>
-          <w:caps w:val="0"/>
-          <w:smallCaps w:val="0"/>
-          <w:noProof w:val="0"/>
+        <w:t xml:space="preserve">portador do CPF nº </w:t>
+      </w:r>
+      <w:r>
+        <w:rPr>
+          <w:rFonts w:ascii="Arial" w:eastAsia="Arial" w:hAnsi="Arial" w:cs="Arial"/>
+          <w:b/>
+          <w:bCs/>
           <w:color w:val="333333"/>
-          <w:sz w:val="24"/>
-          <w:szCs w:val="24"/>
-          <w:lang w:val="pt-BR"/>
-        </w:rPr>
-        <w:t>{CPF_CLIENTE}</w:t>
-      </w:r>
-      <w:r>
-        <w:rPr>
-          <w:noProof w:val="0"/>
-          <w:lang w:val="pt-BR"/>
+          <w:sz w:val="18"/>
+          <w:szCs w:val="18"/>
+        </w:rPr>
+        <w:t>12345678900</w:t>
+      </w:r>
+      <w:r>
+        <w:rPr>
+          <w:sz w:val="18"/>
+          <w:szCs w:val="18"/>
         </w:rPr>
         <w:t xml:space="preserve"> </w:t>
       </w:r>
@@ -907,94 +565,96 @@
       </w:r>
       <w:r>
         <w:rPr>
-          <w:rFonts w:ascii="Arial" w:hAnsi="Arial" w:eastAsia="Arial" w:cs="Arial"/>
-          <w:b w:val="0"/>
-          <w:bCs w:val="0"/>
-          <w:i w:val="0"/>
-          <w:iCs w:val="0"/>
-          <w:caps w:val="0"/>
-          <w:smallCaps w:val="0"/>
-          <w:noProof w:val="0"/>
+          <w:rFonts w:ascii="Arial" w:eastAsia="Arial" w:hAnsi="Arial" w:cs="Arial"/>
+          <w:b/>
+          <w:bCs/>
           <w:color w:val="333333"/>
-          <w:sz w:val="24"/>
-          <w:szCs w:val="24"/>
-          <w:lang w:val="pt-BR"/>
+          <w:sz w:val="18"/>
+          <w:szCs w:val="18"/>
         </w:rPr>
         <w:t>AV SAO JOSE MARIA ESCRIVA 560 BLOCO 11611</w:t>
       </w:r>
       <w:r>
         <w:rPr>
-          <w:rFonts w:ascii="Arial" w:hAnsi="Arial" w:eastAsia="Arial" w:cs="Arial"/>
-          <w:b w:val="0"/>
-          <w:bCs w:val="0"/>
-          <w:i w:val="0"/>
-          <w:iCs w:val="0"/>
-          <w:caps w:val="0"/>
-          <w:smallCaps w:val="0"/>
-          <w:noProof w:val="0"/>
+          <w:rFonts w:ascii="Arial" w:eastAsia="Arial" w:hAnsi="Arial" w:cs="Arial"/>
           <w:color w:val="333333"/>
-          <w:sz w:val="24"/>
-          <w:szCs w:val="24"/>
-          <w:lang w:val="pt-BR"/>
+          <w:sz w:val="18"/>
+          <w:szCs w:val="18"/>
         </w:rPr>
         <w:t xml:space="preserve"> CEP </w:t>
       </w:r>
       <w:r>
         <w:rPr>
-          <w:rFonts w:ascii="Arial" w:hAnsi="Arial" w:eastAsia="Arial" w:cs="Arial"/>
-          <w:b w:val="0"/>
-          <w:bCs w:val="0"/>
-          <w:i w:val="0"/>
-          <w:iCs w:val="0"/>
-          <w:caps w:val="0"/>
-          <w:smallCaps w:val="0"/>
-          <w:noProof w:val="0"/>
+          <w:rFonts w:ascii="Arial" w:eastAsia="Arial" w:hAnsi="Arial" w:cs="Arial"/>
+          <w:b/>
+          <w:bCs/>
           <w:color w:val="333333"/>
-          <w:sz w:val="24"/>
-          <w:szCs w:val="24"/>
-          <w:lang w:val="pt-BR"/>
+          <w:sz w:val="18"/>
+          <w:szCs w:val="18"/>
         </w:rPr>
         <w:t>22753-200</w:t>
       </w:r>
       <w:r>
         <w:rPr>
-          <w:rFonts w:ascii="Arial" w:hAnsi="Arial" w:eastAsia="Arial" w:cs="Arial"/>
-          <w:b w:val="0"/>
-          <w:bCs w:val="0"/>
-          <w:i w:val="0"/>
-          <w:iCs w:val="0"/>
-          <w:caps w:val="0"/>
-          <w:smallCaps w:val="0"/>
-          <w:noProof w:val="0"/>
+          <w:rFonts w:ascii="Arial" w:eastAsia="Arial" w:hAnsi="Arial" w:cs="Arial"/>
           <w:color w:val="333333"/>
-          <w:sz w:val="24"/>
-          <w:szCs w:val="24"/>
-          <w:lang w:val="pt-BR"/>
+          <w:sz w:val="18"/>
+          <w:szCs w:val="18"/>
+        </w:rPr>
+        <w:t xml:space="preserve"> bairro </w:t>
+      </w:r>
+      <w:r>
+        <w:rPr>
+          <w:rFonts w:ascii="Arial" w:eastAsia="Arial" w:hAnsi="Arial" w:cs="Arial"/>
+          <w:b/>
+          <w:bCs/>
+          <w:color w:val="333333"/>
+          <w:sz w:val="18"/>
+          <w:szCs w:val="18"/>
+        </w:rPr>
+        <w:t>COSTA E SILVA</w:t>
+      </w:r>
+      <w:r>
+        <w:rPr>
+          <w:rFonts w:ascii="Arial" w:eastAsia="Arial" w:hAnsi="Arial" w:cs="Arial"/>
+          <w:color w:val="333333"/>
+          <w:sz w:val="18"/>
+          <w:szCs w:val="18"/>
+        </w:rPr>
+        <w:t xml:space="preserve"> cidade </w:t>
+      </w:r>
+      <w:r>
+        <w:rPr>
+          <w:rFonts w:ascii="Arial" w:eastAsia="Arial" w:hAnsi="Arial" w:cs="Arial"/>
+          <w:b/>
+          <w:bCs/>
+          <w:color w:val="333333"/>
+          <w:sz w:val="18"/>
+          <w:szCs w:val="18"/>
+        </w:rPr>
+        <w:t>PORTO ALEGRE/RS</w:t>
+      </w:r>
+      <w:r>
+        <w:rPr>
+          <w:rFonts w:ascii="Arial" w:eastAsia="Arial" w:hAnsi="Arial" w:cs="Arial"/>
+          <w:color w:val="333333"/>
+          <w:sz w:val="18"/>
+          <w:szCs w:val="18"/>
         </w:rPr>
         <w:t xml:space="preserve"> </w:t>
       </w:r>
       <w:r>
         <w:rPr>
-          <w:rFonts w:ascii="Arial" w:hAnsi="Arial" w:eastAsia="Arial" w:cs="Arial"/>
-          <w:b w:val="0"/>
-          <w:bCs w:val="0"/>
-          <w:i w:val="0"/>
-          <w:iCs w:val="0"/>
-          <w:caps w:val="0"/>
-          <w:smallCaps w:val="0"/>
-          <w:noProof w:val="0"/>
+          <w:rFonts w:ascii="Arial" w:eastAsia="Arial" w:hAnsi="Arial" w:cs="Arial"/>
           <w:color w:val="333333"/>
-          <w:sz w:val="24"/>
-          <w:szCs w:val="24"/>
-          <w:lang w:val="pt-BR"/>
+          <w:sz w:val="18"/>
+          <w:szCs w:val="18"/>
         </w:rPr>
         <w:t>i</w:t>
       </w:r>
       <w:r>
         <w:rPr>
           <w:rFonts w:ascii="Arial" w:hAnsi="Arial" w:cs="Arial"/>
-          <w:b w:val="0"/>
-          <w:bCs w:val="0"/>
           <w:sz w:val="18"/>
           <w:szCs w:val="18"/>
         </w:rPr>
@@ -1003,7 +663,7 @@
     </w:p>
     <w:p>
       <w:pPr>
-        <w:pStyle w:val="Corpodetexto2"/>
+        <w:pStyle w:val="BodyText2"/>
         <w:numPr>
           <w:ilvl w:val="0"/>
           <w:numId w:val="1"/>
@@ -1037,26 +697,18 @@
       </w:r>
       <w:r>
         <w:rPr>
-          <w:rFonts w:ascii="Arial" w:hAnsi="Arial" w:eastAsia="Arial" w:cs="Arial"/>
-          <w:b w:val="0"/>
-          <w:bCs w:val="0"/>
-          <w:i w:val="0"/>
-          <w:iCs w:val="0"/>
-          <w:caps w:val="0"/>
-          <w:smallCaps w:val="0"/>
-          <w:noProof w:val="0"/>
+          <w:rFonts w:ascii="Arial" w:eastAsia="Arial" w:hAnsi="Arial" w:cs="Arial"/>
+          <w:b/>
+          <w:bCs/>
           <w:color w:val="333333"/>
           <w:sz w:val="18"/>
           <w:szCs w:val="18"/>
-          <w:lang w:val="pt-BR"/>
-        </w:rPr>
-        <w:t>{NOME_CLIENTE}</w:t>
-      </w:r>
-      <w:r>
-        <w:rPr>
-          <w:rFonts w:ascii="Arial" w:hAnsi="Arial" w:cs="Arial"/>
-          <w:b w:val="0"/>
-          <w:bCs w:val="0"/>
+        </w:rPr>
+        <w:t>JULIANA ALMEIDA</w:t>
+      </w:r>
+      <w:r>
+        <w:rPr>
+          <w:rFonts w:ascii="Arial" w:hAnsi="Arial" w:cs="Arial"/>
           <w:sz w:val="18"/>
           <w:szCs w:val="18"/>
         </w:rPr>
@@ -1068,20 +720,12 @@
           <w:sz w:val="18"/>
           <w:szCs w:val="18"/>
         </w:rPr>
-        <w:t>portador</w:t>
-      </w:r>
-      <w:r>
-        <w:rPr>
-          <w:rFonts w:ascii="Arial" w:hAnsi="Arial" w:cs="Arial"/>
-          <w:sz w:val="18"/>
-          <w:szCs w:val="18"/>
-        </w:rPr>
-        <w:t xml:space="preserve"> do </w:t>
+        <w:t xml:space="preserve">portador do </w:t>
       </w:r>
       <w:r>
         <w:rPr>
           <w:rStyle w:val="clconteudodados1"/>
-          <w:rFonts w:ascii="Arial" w:hAnsi="Arial" w:eastAsia="" w:cs="Arial" w:eastAsiaTheme="majorEastAsia"/>
+          <w:rFonts w:ascii="Arial" w:eastAsiaTheme="majorEastAsia" w:hAnsi="Arial" w:cs="Arial"/>
           <w:sz w:val="18"/>
           <w:szCs w:val="18"/>
         </w:rPr>
@@ -1089,32 +733,26 @@
       </w:r>
       <w:r>
         <w:rPr>
-          <w:rFonts w:ascii="Arial" w:hAnsi="Arial" w:eastAsia="Arial" w:cs="Arial"/>
-          <w:b w:val="0"/>
-          <w:bCs w:val="0"/>
-          <w:i w:val="0"/>
-          <w:iCs w:val="0"/>
-          <w:caps w:val="0"/>
-          <w:smallCaps w:val="0"/>
-          <w:noProof w:val="0"/>
+          <w:rFonts w:ascii="Arial" w:eastAsia="Arial" w:hAnsi="Arial" w:cs="Arial"/>
+          <w:b/>
+          <w:bCs/>
           <w:color w:val="333333"/>
-          <w:sz w:val="24"/>
-          <w:szCs w:val="24"/>
-          <w:lang w:val="pt-BR"/>
-        </w:rPr>
-        <w:t>{NUMERO_SMILES}</w:t>
-      </w:r>
-      <w:r>
-        <w:rPr>
-          <w:noProof w:val="0"/>
-          <w:lang w:val="pt-BR"/>
+          <w:sz w:val="18"/>
+          <w:szCs w:val="18"/>
+        </w:rPr>
+        <w:t>123456789</w:t>
+      </w:r>
+      <w:r>
+        <w:rPr>
+          <w:sz w:val="18"/>
+          <w:szCs w:val="18"/>
         </w:rPr>
         <w:t xml:space="preserve"> </w:t>
       </w:r>
       <w:r>
         <w:rPr>
           <w:rStyle w:val="clconteudodados1"/>
-          <w:rFonts w:ascii="Arial" w:hAnsi="Arial" w:eastAsia="" w:cs="Arial" w:eastAsiaTheme="majorEastAsia"/>
+          <w:rFonts w:ascii="Arial" w:eastAsiaTheme="majorEastAsia" w:hAnsi="Arial" w:cs="Arial"/>
           <w:sz w:val="18"/>
           <w:szCs w:val="18"/>
         </w:rPr>
@@ -1123,7 +761,9 @@
       <w:r>
         <w:rPr>
           <w:rStyle w:val="clconteudodados1"/>
-          <w:rFonts w:ascii="Arial" w:hAnsi="Arial" w:eastAsia="" w:cs="Arial" w:eastAsiaTheme="majorEastAsia"/>
+          <w:rFonts w:ascii="Arial" w:eastAsiaTheme="majorEastAsia" w:hAnsi="Arial" w:cs="Arial"/>
+          <w:b/>
+          <w:bCs/>
           <w:sz w:val="18"/>
           <w:szCs w:val="18"/>
         </w:rPr>
@@ -1132,7 +772,9 @@
       <w:r>
         <w:rPr>
           <w:rStyle w:val="clconteudodados1"/>
-          <w:rFonts w:ascii="Arial" w:hAnsi="Arial" w:eastAsia="" w:cs="Arial" w:eastAsiaTheme="majorEastAsia"/>
+          <w:rFonts w:ascii="Arial" w:eastAsiaTheme="majorEastAsia" w:hAnsi="Arial" w:cs="Arial"/>
+          <w:b/>
+          <w:bCs/>
           <w:sz w:val="18"/>
           <w:szCs w:val="18"/>
         </w:rPr>
@@ -1141,7 +783,9 @@
       <w:r>
         <w:rPr>
           <w:rStyle w:val="clconteudodados1"/>
-          <w:rFonts w:ascii="Arial" w:hAnsi="Arial" w:eastAsia="" w:cs="Arial" w:eastAsiaTheme="majorEastAsia"/>
+          <w:rFonts w:ascii="Arial" w:eastAsiaTheme="majorEastAsia" w:hAnsi="Arial" w:cs="Arial"/>
+          <w:b/>
+          <w:bCs/>
           <w:sz w:val="18"/>
           <w:szCs w:val="18"/>
         </w:rPr>
@@ -1150,7 +794,7 @@
       <w:r>
         <w:rPr>
           <w:rStyle w:val="clconteudodados1"/>
-          <w:rFonts w:ascii="Arial" w:hAnsi="Arial" w:eastAsia="" w:cs="Arial" w:eastAsiaTheme="majorEastAsia"/>
+          <w:rFonts w:ascii="Arial" w:eastAsiaTheme="majorEastAsia" w:hAnsi="Arial" w:cs="Arial"/>
           <w:sz w:val="18"/>
           <w:szCs w:val="18"/>
         </w:rPr>
@@ -1159,7 +803,7 @@
       <w:r>
         <w:rPr>
           <w:rStyle w:val="clconteudodados1"/>
-          <w:rFonts w:ascii="Arial" w:hAnsi="Arial" w:eastAsia="" w:cs="Arial" w:eastAsiaTheme="majorEastAsia"/>
+          <w:rFonts w:ascii="Arial" w:eastAsiaTheme="majorEastAsia" w:hAnsi="Arial" w:cs="Arial"/>
           <w:sz w:val="18"/>
           <w:szCs w:val="18"/>
         </w:rPr>
@@ -1168,29 +812,27 @@
       <w:r>
         <w:rPr>
           <w:rStyle w:val="clconteudodados1"/>
-          <w:rFonts w:ascii="Arial" w:hAnsi="Arial" w:eastAsia="" w:cs="Arial" w:eastAsiaTheme="majorEastAsia"/>
-          <w:b w:val="0"/>
-          <w:bCs w:val="0"/>
-          <w:sz w:val="20"/>
-          <w:szCs w:val="20"/>
+          <w:rFonts w:ascii="Arial" w:eastAsiaTheme="majorEastAsia" w:hAnsi="Arial" w:cs="Arial"/>
+          <w:sz w:val="18"/>
+          <w:szCs w:val="18"/>
         </w:rPr>
         <w:t>)</w:t>
       </w:r>
       <w:r>
         <w:rPr>
           <w:rStyle w:val="clconteudodados1"/>
-          <w:rFonts w:ascii="Arial" w:hAnsi="Arial" w:eastAsia="" w:cs="Arial" w:eastAsiaTheme="majorEastAsia"/>
-          <w:b w:val="1"/>
-          <w:bCs w:val="1"/>
-          <w:sz w:val="20"/>
-          <w:szCs w:val="20"/>
+          <w:rFonts w:ascii="Arial" w:eastAsiaTheme="majorEastAsia" w:hAnsi="Arial" w:cs="Arial"/>
+          <w:b/>
+          <w:bCs/>
+          <w:sz w:val="18"/>
+          <w:szCs w:val="18"/>
         </w:rPr>
         <w:t xml:space="preserve"> </w:t>
       </w:r>
       <w:r>
         <w:rPr>
           <w:rStyle w:val="clconteudodados1"/>
-          <w:rFonts w:ascii="Arial" w:hAnsi="Arial" w:eastAsia="" w:cs="Arial" w:eastAsiaTheme="majorEastAsia"/>
+          <w:rFonts w:ascii="Arial" w:eastAsiaTheme="majorEastAsia" w:hAnsi="Arial" w:cs="Arial"/>
           <w:sz w:val="18"/>
           <w:szCs w:val="18"/>
         </w:rPr>
@@ -1230,36 +872,22 @@
       </w:r>
       <w:r>
         <w:rPr>
-          <w:rFonts w:ascii="Arial" w:hAnsi="Arial" w:eastAsia="Arial" w:cs="Arial"/>
-          <w:b w:val="0"/>
-          <w:bCs w:val="0"/>
-          <w:i w:val="0"/>
-          <w:iCs w:val="0"/>
-          <w:caps w:val="0"/>
-          <w:smallCaps w:val="0"/>
-          <w:noProof w:val="0"/>
+          <w:rFonts w:ascii="Arial" w:eastAsia="Arial" w:hAnsi="Arial" w:cs="Arial"/>
+          <w:b/>
+          <w:bCs/>
           <w:color w:val="333333"/>
-          <w:sz w:val="24"/>
-          <w:szCs w:val="24"/>
-          <w:lang w:val="pt-BR"/>
-        </w:rPr>
-        <w:t>{CPF_CLIENTE}</w:t>
-      </w:r>
-      <w:r>
-        <w:rPr>
-          <w:rFonts w:ascii="Arial" w:hAnsi="Arial" w:cs="Arial"/>
-          <w:sz w:val="18"/>
-          <w:szCs w:val="18"/>
-        </w:rPr>
-        <w:t xml:space="preserve"> informado</w:t>
-      </w:r>
-      <w:r>
-        <w:rPr>
-          <w:rFonts w:ascii="Arial" w:hAnsi="Arial" w:cs="Arial"/>
-          <w:sz w:val="18"/>
-          <w:szCs w:val="18"/>
-        </w:rPr>
-        <w:t xml:space="preserve"> pel</w:t>
+          <w:sz w:val="18"/>
+          <w:szCs w:val="18"/>
+        </w:rPr>
+        <w:t>12345678900</w:t>
+      </w:r>
+      <w:r>
+        <w:rPr>
+          <w:rFonts w:ascii="Arial" w:hAnsi="Arial" w:cs="Arial"/>
+          <w:sz w:val="18"/>
+          <w:szCs w:val="18"/>
+        </w:rPr>
+        <w:t xml:space="preserve"> informado pel</w:t>
       </w:r>
       <w:r>
         <w:rPr>
@@ -1280,9 +908,9 @@
     </w:p>
     <w:p>
       <w:pPr>
-        <w:pStyle w:val="Corpodetexto2"/>
+        <w:pStyle w:val="BodyText2"/>
         <w:tabs>
-          <w:tab w:val="left" w:leader="none" w:pos="1620"/>
+          <w:tab w:val="left" w:pos="1620"/>
         </w:tabs>
         <w:spacing w:after="0" w:line="276" w:lineRule="auto"/>
         <w:ind w:left="360"/>
@@ -1296,7 +924,7 @@
     </w:p>
     <w:p>
       <w:pPr>
-        <w:pStyle w:val="Corpodetexto2"/>
+        <w:pStyle w:val="BodyText2"/>
         <w:numPr>
           <w:ilvl w:val="0"/>
           <w:numId w:val="1"/>
@@ -1323,7 +951,7 @@
     </w:p>
     <w:p>
       <w:pPr>
-        <w:pStyle w:val="Corpodetexto2"/>
+        <w:pStyle w:val="BodyText2"/>
         <w:numPr>
           <w:ilvl w:val="0"/>
           <w:numId w:val="2"/>
@@ -1350,7 +978,7 @@
     </w:p>
     <w:p>
       <w:pPr>
-        <w:pStyle w:val="Corpodetexto2"/>
+        <w:pStyle w:val="BodyText2"/>
         <w:numPr>
           <w:ilvl w:val="0"/>
           <w:numId w:val="2"/>
@@ -1377,7 +1005,7 @@
     </w:p>
     <w:p>
       <w:pPr>
-        <w:pStyle w:val="Corpodetexto2"/>
+        <w:pStyle w:val="BodyText2"/>
         <w:numPr>
           <w:ilvl w:val="0"/>
           <w:numId w:val="2"/>
@@ -1404,7 +1032,7 @@
     </w:p>
     <w:p>
       <w:pPr>
-        <w:pStyle w:val="Corpodetexto2"/>
+        <w:pStyle w:val="BodyText2"/>
         <w:numPr>
           <w:ilvl w:val="0"/>
           <w:numId w:val="2"/>
@@ -1431,7 +1059,7 @@
     </w:p>
     <w:p>
       <w:pPr>
-        <w:pStyle w:val="Corpodetexto2"/>
+        <w:pStyle w:val="BodyText2"/>
         <w:numPr>
           <w:ilvl w:val="0"/>
           <w:numId w:val="1"/>
@@ -1458,7 +1086,7 @@
     </w:p>
     <w:p>
       <w:pPr>
-        <w:pStyle w:val="Corpodetexto2"/>
+        <w:pStyle w:val="BodyText2"/>
         <w:numPr>
           <w:ilvl w:val="0"/>
           <w:numId w:val="3"/>
@@ -1485,7 +1113,7 @@
     </w:p>
     <w:p>
       <w:pPr>
-        <w:pStyle w:val="Corpodetexto2"/>
+        <w:pStyle w:val="BodyText2"/>
         <w:numPr>
           <w:ilvl w:val="0"/>
           <w:numId w:val="3"/>
@@ -1512,7 +1140,7 @@
     </w:p>
     <w:p>
       <w:pPr>
-        <w:pStyle w:val="Corpodetexto2"/>
+        <w:pStyle w:val="BodyText2"/>
         <w:numPr>
           <w:ilvl w:val="0"/>
           <w:numId w:val="3"/>
@@ -1539,7 +1167,7 @@
     </w:p>
     <w:p>
       <w:pPr>
-        <w:pStyle w:val="Corpodetexto2"/>
+        <w:pStyle w:val="BodyText2"/>
         <w:numPr>
           <w:ilvl w:val="0"/>
           <w:numId w:val="3"/>
@@ -1566,7 +1194,7 @@
     </w:p>
     <w:p>
       <w:pPr>
-        <w:pStyle w:val="Corpodetexto2"/>
+        <w:pStyle w:val="BodyText2"/>
         <w:numPr>
           <w:ilvl w:val="0"/>
           <w:numId w:val="3"/>
@@ -1593,7 +1221,7 @@
     </w:p>
     <w:p>
       <w:pPr>
-        <w:pStyle w:val="Corpodetexto2"/>
+        <w:pStyle w:val="BodyText2"/>
         <w:numPr>
           <w:ilvl w:val="0"/>
           <w:numId w:val="1"/>
@@ -1620,7 +1248,7 @@
     </w:p>
     <w:p>
       <w:pPr>
-        <w:pStyle w:val="Corpodetexto2"/>
+        <w:pStyle w:val="BodyText2"/>
         <w:numPr>
           <w:ilvl w:val="0"/>
           <w:numId w:val="1"/>
@@ -1647,8 +1275,8 @@
       <w:r>
         <w:rPr>
           <w:rFonts w:ascii="Arial" w:hAnsi="Arial" w:cs="Arial"/>
-          <w:b w:val="1"/>
-          <w:bCs w:val="1"/>
+          <w:b/>
+          <w:bCs/>
           <w:sz w:val="18"/>
           <w:szCs w:val="18"/>
         </w:rPr>
@@ -1665,7 +1293,7 @@
     </w:p>
     <w:p>
       <w:pPr>
-        <w:pStyle w:val="Corpodetexto2"/>
+        <w:pStyle w:val="BodyText2"/>
         <w:numPr>
           <w:ilvl w:val="0"/>
           <w:numId w:val="1"/>
@@ -1692,7 +1320,6 @@
     </w:p>
     <w:p>
       <w:pPr>
-        <w:pStyle w:val="Normal"/>
         <w:spacing w:line="360" w:lineRule="auto"/>
         <w:ind w:firstLine="391"/>
         <w:jc w:val="both"/>
@@ -1720,26 +1347,20 @@
       </w:r>
       <w:r>
         <w:rPr>
-          <w:rFonts w:ascii="Arial" w:hAnsi="Arial" w:eastAsia="Arial" w:cs="Arial"/>
-          <w:b w:val="0"/>
-          <w:bCs w:val="0"/>
-          <w:i w:val="0"/>
-          <w:iCs w:val="0"/>
-          <w:caps w:val="0"/>
-          <w:smallCaps w:val="0"/>
-          <w:noProof w:val="0"/>
+          <w:rFonts w:ascii="Arial" w:eastAsia="Arial" w:hAnsi="Arial" w:cs="Arial"/>
+          <w:b/>
+          <w:bCs/>
           <w:color w:val="333333"/>
           <w:sz w:val="18"/>
           <w:szCs w:val="18"/>
-          <w:lang w:val="pt-BR"/>
-        </w:rPr>
-        <w:t>{NOME_CLIENTE}</w:t>
-      </w:r>
-      <w:r>
-        <w:rPr>
-          <w:rFonts w:ascii="Arial" w:hAnsi="Arial" w:cs="Arial"/>
-          <w:b w:val="1"/>
-          <w:bCs w:val="1"/>
+        </w:rPr>
+        <w:t>JULIANA ALMEIDA</w:t>
+      </w:r>
+      <w:r>
+        <w:rPr>
+          <w:rFonts w:ascii="Arial" w:hAnsi="Arial" w:cs="Arial"/>
+          <w:b/>
+          <w:bCs/>
           <w:sz w:val="18"/>
           <w:szCs w:val="18"/>
         </w:rPr>
@@ -1756,90 +1377,152 @@
     </w:p>
     <w:p>
       <w:pPr>
-        <w:pStyle w:val="Corpodetexto2"/>
-        <w:suppressLineNumbers w:val="0"/>
-        <w:bidi w:val="0"/>
-        <w:spacing w:before="0" w:beforeAutospacing="off" w:after="120" w:afterAutospacing="off" w:line="360" w:lineRule="auto"/>
-        <w:ind w:left="0" w:right="0"/>
+        <w:pStyle w:val="BodyText2"/>
+        <w:spacing w:line="360" w:lineRule="auto"/>
         <w:jc w:val="both"/>
-      </w:pPr>
-      <w:r>
-        <w:rPr>
-          <w:rFonts w:ascii="Arial" w:hAnsi="Arial" w:cs="Arial"/>
-          <w:sz w:val="16"/>
-          <w:szCs w:val="16"/>
+        <w:rPr>
+          <w:rFonts w:ascii="Arial" w:hAnsi="Arial" w:cs="Arial"/>
+          <w:sz w:val="18"/>
+          <w:szCs w:val="18"/>
           <w:lang w:val="es-ES"/>
         </w:rPr>
-        <w:t>{CIDADE_UF},1</w:t>
-      </w:r>
-      <w:r>
-        <w:rPr>
-          <w:rFonts w:ascii="Arial" w:hAnsi="Arial" w:cs="Arial"/>
-          <w:sz w:val="16"/>
-          <w:szCs w:val="16"/>
-          <w:lang w:val="es-ES"/>
-        </w:rPr>
-        <w:t>9</w:t>
-      </w:r>
-      <w:r>
-        <w:rPr>
-          <w:rFonts w:ascii="Arial" w:hAnsi="Arial" w:cs="Arial"/>
-          <w:sz w:val="16"/>
-          <w:szCs w:val="16"/>
-          <w:lang w:val="es-ES"/>
-        </w:rPr>
-        <w:t xml:space="preserve"> DE ABRIL DE 2026</w:t>
-      </w:r>
+      </w:pPr>
     </w:p>
     <w:p>
       <w:pPr>
-        <w:pStyle w:val="Corpodetexto2"/>
+        <w:pStyle w:val="BodyText2"/>
         <w:spacing w:line="360" w:lineRule="auto"/>
         <w:jc w:val="both"/>
         <w:rPr>
           <w:rFonts w:ascii="Arial" w:hAnsi="Arial" w:cs="Arial"/>
-          <w:sz w:val="16"/>
-          <w:szCs w:val="16"/>
-        </w:rPr>
-      </w:pPr>
-      <w:r>
-        <w:rPr>
-          <w:rFonts w:ascii="Arial" w:hAnsi="Arial" w:cs="Arial"/>
-          <w:sz w:val="16"/>
-          <w:szCs w:val="16"/>
+          <w:sz w:val="18"/>
+          <w:szCs w:val="18"/>
           <w:lang w:val="es-ES"/>
         </w:rPr>
-        <w:t xml:space="preserve"> _________________________________                                                                                                   _________________________________</w:t>
+      </w:pPr>
+      <w:r>
+        <w:rPr>
+          <w:rFonts w:ascii="Arial" w:hAnsi="Arial" w:cs="Arial"/>
+          <w:sz w:val="18"/>
+          <w:szCs w:val="18"/>
+          <w:lang w:val="es-ES"/>
+        </w:rPr>
+        <w:t>PORTO ALEGRE/RS,1</w:t>
+      </w:r>
+      <w:r>
+        <w:rPr>
+          <w:rFonts w:ascii="Arial" w:hAnsi="Arial" w:cs="Arial"/>
+          <w:sz w:val="18"/>
+          <w:szCs w:val="18"/>
+          <w:lang w:val="es-ES"/>
+        </w:rPr>
+        <w:t>9</w:t>
+      </w:r>
+      <w:r>
+        <w:rPr>
+          <w:rFonts w:ascii="Arial" w:hAnsi="Arial" w:cs="Arial"/>
+          <w:sz w:val="18"/>
+          <w:szCs w:val="18"/>
+          <w:lang w:val="es-ES"/>
+        </w:rPr>
+        <w:t xml:space="preserve"> DE ABRIL DE 2026</w:t>
       </w:r>
     </w:p>
     <w:p>
       <w:pPr>
-        <w:pStyle w:val="Corpodetexto2"/>
+        <w:pStyle w:val="BodyText2"/>
         <w:spacing w:line="360" w:lineRule="auto"/>
         <w:jc w:val="both"/>
         <w:rPr>
-          <w:rFonts w:ascii="Arial" w:hAnsi="Arial" w:cs="Arial"/>
-          <w:b w:val="1"/>
-          <w:bCs w:val="1"/>
-          <w:sz w:val="16"/>
-          <w:szCs w:val="16"/>
+          <w:sz w:val="18"/>
+          <w:szCs w:val="18"/>
+        </w:rPr>
+      </w:pPr>
+    </w:p>
+    <w:p>
+      <w:pPr>
+        <w:pStyle w:val="BodyText2"/>
+        <w:spacing w:line="360" w:lineRule="auto"/>
+        <w:jc w:val="both"/>
+        <w:rPr>
+          <w:rFonts w:ascii="Arial" w:hAnsi="Arial" w:cs="Arial"/>
+          <w:sz w:val="18"/>
+          <w:szCs w:val="18"/>
+        </w:rPr>
+      </w:pPr>
+      <w:r>
+        <w:rPr>
+          <w:rFonts w:ascii="Arial" w:hAnsi="Arial" w:cs="Arial"/>
+          <w:sz w:val="18"/>
+          <w:szCs w:val="18"/>
           <w:lang w:val="es-ES"/>
         </w:rPr>
-      </w:pPr>
-      <w:r>
-        <w:rPr>
-          <w:rFonts w:ascii="Arial" w:hAnsi="Arial" w:cs="Arial"/>
-          <w:b w:val="1"/>
-          <w:bCs w:val="1"/>
-          <w:sz w:val="16"/>
-          <w:szCs w:val="16"/>
+        <w:t xml:space="preserve"> _________________________________                                                                                                   _________________________________</w:t>
+      </w:r>
+    </w:p>
+    <w:p>
+      <w:pPr>
+        <w:pStyle w:val="BodyText2"/>
+        <w:spacing w:line="360" w:lineRule="auto"/>
+        <w:jc w:val="both"/>
+        <w:rPr>
+          <w:rFonts w:ascii="Arial" w:hAnsi="Arial" w:cs="Arial"/>
+          <w:b/>
+          <w:bCs/>
+          <w:sz w:val="18"/>
+          <w:szCs w:val="18"/>
           <w:lang w:val="es-ES"/>
         </w:rPr>
-        <w:t xml:space="preserve">            GOL LINHAS AEREAS                                                                                                                    ASSINATURA DO CLIENTE</w:t>
+      </w:pPr>
+      <w:r>
+        <w:rPr>
+          <w:rFonts w:ascii="Arial" w:hAnsi="Arial" w:cs="Arial"/>
+          <w:b/>
+          <w:bCs/>
+          <w:sz w:val="18"/>
+          <w:szCs w:val="18"/>
+          <w:lang w:val="es-ES"/>
+        </w:rPr>
+        <w:t xml:space="preserve">         GOL LINHAS </w:t>
+      </w:r>
+      <w:proofErr w:type="gramStart"/>
+      <w:r>
+        <w:rPr>
+          <w:rFonts w:ascii="Arial" w:hAnsi="Arial" w:cs="Arial"/>
+          <w:b/>
+          <w:bCs/>
+          <w:sz w:val="18"/>
+          <w:szCs w:val="18"/>
+          <w:lang w:val="es-ES"/>
+        </w:rPr>
+        <w:t xml:space="preserve">AEREAS  </w:t>
+      </w:r>
+      <w:r>
+        <w:rPr>
+          <w:rFonts w:ascii="Arial" w:hAnsi="Arial" w:cs="Arial"/>
+          <w:b/>
+          <w:bCs/>
+          <w:sz w:val="18"/>
+          <w:szCs w:val="18"/>
+          <w:lang w:val="es-ES"/>
+        </w:rPr>
+        <w:t>S.A</w:t>
+      </w:r>
+      <w:proofErr w:type="gramEnd"/>
+      <w:r>
+        <w:rPr>
+          <w:rFonts w:ascii="Arial" w:hAnsi="Arial" w:cs="Arial"/>
+          <w:b/>
+          <w:bCs/>
+          <w:sz w:val="18"/>
+          <w:szCs w:val="18"/>
+          <w:lang w:val="es-ES"/>
+        </w:rPr>
+        <w:t xml:space="preserve">                                                                                                      ASSINATURA DO CLIENTE</w:t>
       </w:r>
     </w:p>
     <w:sectPr>
-      <w:pgSz w:w="11906" w:h="16838" w:orient="portrait"/>
+      <w:pgSz w:w="11906" w:h="16838"/>
       <w:pgMar w:top="450" w:right="720" w:bottom="720" w:left="720" w:header="708" w:footer="708" w:gutter="0"/>
       <w:cols w:space="708"/>
       <w:docGrid w:linePitch="360"/>
@@ -1863,7 +1546,7 @@
         <w:ind w:left="720" w:hanging="360"/>
       </w:pPr>
       <w:rPr>
-        <w:rFonts w:hint="default" w:ascii="Symbol" w:hAnsi="Symbol"/>
+        <w:rFonts w:ascii="Symbol" w:hAnsi="Symbol" w:hint="default"/>
       </w:rPr>
     </w:lvl>
     <w:lvl w:ilvl="1" w:tplc="04160003" w:tentative="1">
@@ -1875,7 +1558,7 @@
         <w:ind w:left="1440" w:hanging="360"/>
       </w:pPr>
       <w:rPr>
-        <w:rFonts w:hint="default" w:ascii="Courier New" w:hAnsi="Courier New" w:cs="Courier New"/>
+        <w:rFonts w:ascii="Courier New" w:hAnsi="Courier New" w:cs="Courier New" w:hint="default"/>
       </w:rPr>
     </w:lvl>
     <w:lvl w:ilvl="2" w:tplc="04160005" w:tentative="1">
@@ -1887,7 +1570,7 @@
         <w:ind w:left="2160" w:hanging="360"/>
       </w:pPr>
       <w:rPr>
-        <w:rFonts w:hint="default" w:ascii="Wingdings" w:hAnsi="Wingdings"/>
+        <w:rFonts w:ascii="Wingdings" w:hAnsi="Wingdings" w:hint="default"/>
       </w:rPr>
     </w:lvl>
     <w:lvl w:ilvl="3" w:tplc="04160001" w:tentative="1">
@@ -1899,7 +1582,7 @@
         <w:ind w:left="2880" w:hanging="360"/>
       </w:pPr>
       <w:rPr>
-        <w:rFonts w:hint="default" w:ascii="Symbol" w:hAnsi="Symbol"/>
+        <w:rFonts w:ascii="Symbol" w:hAnsi="Symbol" w:hint="default"/>
       </w:rPr>
     </w:lvl>
     <w:lvl w:ilvl="4" w:tplc="04160003" w:tentative="1">
@@ -1911,7 +1594,7 @@
         <w:ind w:left="3600" w:hanging="360"/>
       </w:pPr>
       <w:rPr>
-        <w:rFonts w:hint="default" w:ascii="Courier New" w:hAnsi="Courier New" w:cs="Courier New"/>
+        <w:rFonts w:ascii="Courier New" w:hAnsi="Courier New" w:cs="Courier New" w:hint="default"/>
       </w:rPr>
     </w:lvl>
     <w:lvl w:ilvl="5" w:tplc="04160005" w:tentative="1">
@@ -1923,7 +1606,7 @@
         <w:ind w:left="4320" w:hanging="360"/>
       </w:pPr>
       <w:rPr>
-        <w:rFonts w:hint="default" w:ascii="Wingdings" w:hAnsi="Wingdings"/>
+        <w:rFonts w:ascii="Wingdings" w:hAnsi="Wingdings" w:hint="default"/>
       </w:rPr>
     </w:lvl>
     <w:lvl w:ilvl="6" w:tplc="04160001" w:tentative="1">
@@ -1935,7 +1618,7 @@
         <w:ind w:left="5040" w:hanging="360"/>
       </w:pPr>
       <w:rPr>
-        <w:rFonts w:hint="default" w:ascii="Symbol" w:hAnsi="Symbol"/>
+        <w:rFonts w:ascii="Symbol" w:hAnsi="Symbol" w:hint="default"/>
       </w:rPr>
     </w:lvl>
     <w:lvl w:ilvl="7" w:tplc="04160003" w:tentative="1">
@@ -1947,7 +1630,7 @@
         <w:ind w:left="5760" w:hanging="360"/>
       </w:pPr>
       <w:rPr>
-        <w:rFonts w:hint="default" w:ascii="Courier New" w:hAnsi="Courier New" w:cs="Courier New"/>
+        <w:rFonts w:ascii="Courier New" w:hAnsi="Courier New" w:cs="Courier New" w:hint="default"/>
       </w:rPr>
     </w:lvl>
     <w:lvl w:ilvl="8" w:tplc="04160005" w:tentative="1">
@@ -1959,7 +1642,7 @@
         <w:ind w:left="6480" w:hanging="360"/>
       </w:pPr>
       <w:rPr>
-        <w:rFonts w:hint="default" w:ascii="Wingdings" w:hAnsi="Wingdings"/>
+        <w:rFonts w:ascii="Wingdings" w:hAnsi="Wingdings" w:hint="default"/>
       </w:rPr>
     </w:lvl>
   </w:abstractNum>
@@ -1976,7 +1659,7 @@
         <w:ind w:left="1080" w:hanging="360"/>
       </w:pPr>
       <w:rPr>
-        <w:rFonts w:hint="default" w:ascii="Symbol" w:hAnsi="Symbol"/>
+        <w:rFonts w:ascii="Symbol" w:hAnsi="Symbol" w:hint="default"/>
       </w:rPr>
     </w:lvl>
     <w:lvl w:ilvl="1" w:tplc="04160003" w:tentative="1">
@@ -1988,7 +1671,7 @@
         <w:ind w:left="1800" w:hanging="360"/>
       </w:pPr>
       <w:rPr>
-        <w:rFonts w:hint="default" w:ascii="Courier New" w:hAnsi="Courier New" w:cs="Courier New"/>
+        <w:rFonts w:ascii="Courier New" w:hAnsi="Courier New" w:cs="Courier New" w:hint="default"/>
       </w:rPr>
     </w:lvl>
     <w:lvl w:ilvl="2" w:tplc="04160005" w:tentative="1">
@@ -2000,7 +1683,7 @@
         <w:ind w:left="2520" w:hanging="360"/>
       </w:pPr>
       <w:rPr>
-        <w:rFonts w:hint="default" w:ascii="Wingdings" w:hAnsi="Wingdings"/>
+        <w:rFonts w:ascii="Wingdings" w:hAnsi="Wingdings" w:hint="default"/>
       </w:rPr>
     </w:lvl>
     <w:lvl w:ilvl="3" w:tplc="04160001" w:tentative="1">
@@ -2012,7 +1695,7 @@
         <w:ind w:left="3240" w:hanging="360"/>
       </w:pPr>
       <w:rPr>
-        <w:rFonts w:hint="default" w:ascii="Symbol" w:hAnsi="Symbol"/>
+        <w:rFonts w:ascii="Symbol" w:hAnsi="Symbol" w:hint="default"/>
       </w:rPr>
     </w:lvl>
     <w:lvl w:ilvl="4" w:tplc="04160003" w:tentative="1">
@@ -2024,7 +1707,7 @@
         <w:ind w:left="3960" w:hanging="360"/>
       </w:pPr>
       <w:rPr>
-        <w:rFonts w:hint="default" w:ascii="Courier New" w:hAnsi="Courier New" w:cs="Courier New"/>
+        <w:rFonts w:ascii="Courier New" w:hAnsi="Courier New" w:cs="Courier New" w:hint="default"/>
       </w:rPr>
     </w:lvl>
     <w:lvl w:ilvl="5" w:tplc="04160005" w:tentative="1">
@@ -2036,7 +1719,7 @@
         <w:ind w:left="4680" w:hanging="360"/>
       </w:pPr>
       <w:rPr>
-        <w:rFonts w:hint="default" w:ascii="Wingdings" w:hAnsi="Wingdings"/>
+        <w:rFonts w:ascii="Wingdings" w:hAnsi="Wingdings" w:hint="default"/>
       </w:rPr>
     </w:lvl>
     <w:lvl w:ilvl="6" w:tplc="04160001" w:tentative="1">
@@ -2048,7 +1731,7 @@
         <w:ind w:left="5400" w:hanging="360"/>
       </w:pPr>
       <w:rPr>
-        <w:rFonts w:hint="default" w:ascii="Symbol" w:hAnsi="Symbol"/>
+        <w:rFonts w:ascii="Symbol" w:hAnsi="Symbol" w:hint="default"/>
       </w:rPr>
     </w:lvl>
     <w:lvl w:ilvl="7" w:tplc="04160003" w:tentative="1">
@@ -2060,7 +1743,7 @@
         <w:ind w:left="6120" w:hanging="360"/>
       </w:pPr>
       <w:rPr>
-        <w:rFonts w:hint="default" w:ascii="Courier New" w:hAnsi="Courier New" w:cs="Courier New"/>
+        <w:rFonts w:ascii="Courier New" w:hAnsi="Courier New" w:cs="Courier New" w:hint="default"/>
       </w:rPr>
     </w:lvl>
     <w:lvl w:ilvl="8" w:tplc="04160005" w:tentative="1">
@@ -2072,7 +1755,7 @@
         <w:ind w:left="6840" w:hanging="360"/>
       </w:pPr>
       <w:rPr>
-        <w:rFonts w:hint="default" w:ascii="Wingdings" w:hAnsi="Wingdings"/>
+        <w:rFonts w:ascii="Wingdings" w:hAnsi="Wingdings" w:hint="default"/>
       </w:rPr>
     </w:lvl>
   </w:abstractNum>
@@ -2207,7 +1890,7 @@
         <w:ind w:left="720" w:hanging="360"/>
       </w:pPr>
       <w:rPr>
-        <w:rFonts w:hint="default" w:ascii="Symbol" w:hAnsi="Symbol"/>
+        <w:rFonts w:ascii="Symbol" w:hAnsi="Symbol" w:hint="default"/>
       </w:rPr>
     </w:lvl>
     <w:lvl w:ilvl="1" w:tplc="04160003" w:tentative="1">
@@ -2219,7 +1902,7 @@
         <w:ind w:left="1440" w:hanging="360"/>
       </w:pPr>
       <w:rPr>
-        <w:rFonts w:hint="default" w:ascii="Courier New" w:hAnsi="Courier New" w:cs="Courier New"/>
+        <w:rFonts w:ascii="Courier New" w:hAnsi="Courier New" w:cs="Courier New" w:hint="default"/>
       </w:rPr>
     </w:lvl>
     <w:lvl w:ilvl="2" w:tplc="04160005" w:tentative="1">
@@ -2231,7 +1914,7 @@
         <w:ind w:left="2160" w:hanging="360"/>
       </w:pPr>
       <w:rPr>
-        <w:rFonts w:hint="default" w:ascii="Wingdings" w:hAnsi="Wingdings"/>
+        <w:rFonts w:ascii="Wingdings" w:hAnsi="Wingdings" w:hint="default"/>
       </w:rPr>
     </w:lvl>
     <w:lvl w:ilvl="3" w:tplc="04160001" w:tentative="1">
@@ -2243,7 +1926,7 @@
         <w:ind w:left="2880" w:hanging="360"/>
       </w:pPr>
       <w:rPr>
-        <w:rFonts w:hint="default" w:ascii="Symbol" w:hAnsi="Symbol"/>
+        <w:rFonts w:ascii="Symbol" w:hAnsi="Symbol" w:hint="default"/>
       </w:rPr>
     </w:lvl>
     <w:lvl w:ilvl="4" w:tplc="04160003" w:tentative="1">
@@ -2255,7 +1938,7 @@
         <w:ind w:left="3600" w:hanging="360"/>
       </w:pPr>
       <w:rPr>
-        <w:rFonts w:hint="default" w:ascii="Courier New" w:hAnsi="Courier New" w:cs="Courier New"/>
+        <w:rFonts w:ascii="Courier New" w:hAnsi="Courier New" w:cs="Courier New" w:hint="default"/>
       </w:rPr>
     </w:lvl>
     <w:lvl w:ilvl="5" w:tplc="04160005" w:tentative="1">
@@ -2267,7 +1950,7 @@
         <w:ind w:left="4320" w:hanging="360"/>
       </w:pPr>
       <w:rPr>
-        <w:rFonts w:hint="default" w:ascii="Wingdings" w:hAnsi="Wingdings"/>
+        <w:rFonts w:ascii="Wingdings" w:hAnsi="Wingdings" w:hint="default"/>
       </w:rPr>
     </w:lvl>
     <w:lvl w:ilvl="6" w:tplc="04160001" w:tentative="1">
@@ -2279,7 +1962,7 @@
         <w:ind w:left="5040" w:hanging="360"/>
       </w:pPr>
       <w:rPr>
-        <w:rFonts w:hint="default" w:ascii="Symbol" w:hAnsi="Symbol"/>
+        <w:rFonts w:ascii="Symbol" w:hAnsi="Symbol" w:hint="default"/>
       </w:rPr>
     </w:lvl>
     <w:lvl w:ilvl="7" w:tplc="04160003" w:tentative="1">
@@ -2291,7 +1974,7 @@
         <w:ind w:left="5760" w:hanging="360"/>
       </w:pPr>
       <w:rPr>
-        <w:rFonts w:hint="default" w:ascii="Courier New" w:hAnsi="Courier New" w:cs="Courier New"/>
+        <w:rFonts w:ascii="Courier New" w:hAnsi="Courier New" w:cs="Courier New" w:hint="default"/>
       </w:rPr>
     </w:lvl>
     <w:lvl w:ilvl="8" w:tplc="04160005" w:tentative="1">
@@ -2303,7 +1986,7 @@
         <w:ind w:left="6480" w:hanging="360"/>
       </w:pPr>
       <w:rPr>
-        <w:rFonts w:hint="default" w:ascii="Wingdings" w:hAnsi="Wingdings"/>
+        <w:rFonts w:ascii="Wingdings" w:hAnsi="Wingdings" w:hint="default"/>
       </w:rPr>
     </w:lvl>
   </w:abstractNum>
@@ -2320,7 +2003,7 @@
         <w:ind w:left="1080" w:hanging="360"/>
       </w:pPr>
       <w:rPr>
-        <w:rFonts w:hint="default" w:ascii="Symbol" w:hAnsi="Symbol"/>
+        <w:rFonts w:ascii="Symbol" w:hAnsi="Symbol" w:hint="default"/>
       </w:rPr>
     </w:lvl>
     <w:lvl w:ilvl="1" w:tplc="04160003" w:tentative="1">
@@ -2332,7 +2015,7 @@
         <w:ind w:left="1800" w:hanging="360"/>
       </w:pPr>
       <w:rPr>
-        <w:rFonts w:hint="default" w:ascii="Courier New" w:hAnsi="Courier New" w:cs="Courier New"/>
+        <w:rFonts w:ascii="Courier New" w:hAnsi="Courier New" w:cs="Courier New" w:hint="default"/>
       </w:rPr>
     </w:lvl>
     <w:lvl w:ilvl="2" w:tplc="04160005" w:tentative="1">
@@ -2344,7 +2027,7 @@
         <w:ind w:left="2520" w:hanging="360"/>
       </w:pPr>
       <w:rPr>
-        <w:rFonts w:hint="default" w:ascii="Wingdings" w:hAnsi="Wingdings"/>
+        <w:rFonts w:ascii="Wingdings" w:hAnsi="Wingdings" w:hint="default"/>
       </w:rPr>
     </w:lvl>
     <w:lvl w:ilvl="3" w:tplc="04160001" w:tentative="1">
@@ -2356,7 +2039,7 @@
         <w:ind w:left="3240" w:hanging="360"/>
       </w:pPr>
       <w:rPr>
-        <w:rFonts w:hint="default" w:ascii="Symbol" w:hAnsi="Symbol"/>
+        <w:rFonts w:ascii="Symbol" w:hAnsi="Symbol" w:hint="default"/>
       </w:rPr>
     </w:lvl>
     <w:lvl w:ilvl="4" w:tplc="04160003" w:tentative="1">
@@ -2368,7 +2051,7 @@
         <w:ind w:left="3960" w:hanging="360"/>
       </w:pPr>
       <w:rPr>
-        <w:rFonts w:hint="default" w:ascii="Courier New" w:hAnsi="Courier New" w:cs="Courier New"/>
+        <w:rFonts w:ascii="Courier New" w:hAnsi="Courier New" w:cs="Courier New" w:hint="default"/>
       </w:rPr>
     </w:lvl>
     <w:lvl w:ilvl="5" w:tplc="04160005" w:tentative="1">
@@ -2380,7 +2063,7 @@
         <w:ind w:left="4680" w:hanging="360"/>
       </w:pPr>
       <w:rPr>
-        <w:rFonts w:hint="default" w:ascii="Wingdings" w:hAnsi="Wingdings"/>
+        <w:rFonts w:ascii="Wingdings" w:hAnsi="Wingdings" w:hint="default"/>
       </w:rPr>
     </w:lvl>
     <w:lvl w:ilvl="6" w:tplc="04160001" w:tentative="1">
@@ -2392,7 +2075,7 @@
         <w:ind w:left="5400" w:hanging="360"/>
       </w:pPr>
       <w:rPr>
-        <w:rFonts w:hint="default" w:ascii="Symbol" w:hAnsi="Symbol"/>
+        <w:rFonts w:ascii="Symbol" w:hAnsi="Symbol" w:hint="default"/>
       </w:rPr>
     </w:lvl>
     <w:lvl w:ilvl="7" w:tplc="04160003" w:tentative="1">
@@ -2404,7 +2087,7 @@
         <w:ind w:left="6120" w:hanging="360"/>
       </w:pPr>
       <w:rPr>
-        <w:rFonts w:hint="default" w:ascii="Courier New" w:hAnsi="Courier New" w:cs="Courier New"/>
+        <w:rFonts w:ascii="Courier New" w:hAnsi="Courier New" w:cs="Courier New" w:hint="default"/>
       </w:rPr>
     </w:lvl>
     <w:lvl w:ilvl="8" w:tplc="04160005" w:tentative="1">
@@ -2416,7 +2099,7 @@
         <w:ind w:left="6840" w:hanging="360"/>
       </w:pPr>
       <w:rPr>
-        <w:rFonts w:hint="default" w:ascii="Wingdings" w:hAnsi="Wingdings"/>
+        <w:rFonts w:ascii="Wingdings" w:hAnsi="Wingdings" w:hint="default"/>
       </w:rPr>
     </w:lvl>
   </w:abstractNum>
@@ -2433,7 +2116,7 @@
         <w:ind w:left="720" w:hanging="360"/>
       </w:pPr>
       <w:rPr>
-        <w:rFonts w:hint="default" w:ascii="Symbol" w:hAnsi="Symbol"/>
+        <w:rFonts w:ascii="Symbol" w:hAnsi="Symbol" w:hint="default"/>
       </w:rPr>
     </w:lvl>
     <w:lvl w:ilvl="1" w:tplc="04160003" w:tentative="1">
@@ -2445,7 +2128,7 @@
         <w:ind w:left="1440" w:hanging="360"/>
       </w:pPr>
       <w:rPr>
-        <w:rFonts w:hint="default" w:ascii="Courier New" w:hAnsi="Courier New" w:cs="Courier New"/>
+        <w:rFonts w:ascii="Courier New" w:hAnsi="Courier New" w:cs="Courier New" w:hint="default"/>
       </w:rPr>
     </w:lvl>
     <w:lvl w:ilvl="2" w:tplc="04160005" w:tentative="1">
@@ -2457,7 +2140,7 @@
         <w:ind w:left="2160" w:hanging="360"/>
       </w:pPr>
       <w:rPr>
-        <w:rFonts w:hint="default" w:ascii="Wingdings" w:hAnsi="Wingdings"/>
+        <w:rFonts w:ascii="Wingdings" w:hAnsi="Wingdings" w:hint="default"/>
       </w:rPr>
     </w:lvl>
     <w:lvl w:ilvl="3" w:tplc="04160001" w:tentative="1">
@@ -2469,7 +2152,7 @@
         <w:ind w:left="2880" w:hanging="360"/>
       </w:pPr>
       <w:rPr>
-        <w:rFonts w:hint="default" w:ascii="Symbol" w:hAnsi="Symbol"/>
+        <w:rFonts w:ascii="Symbol" w:hAnsi="Symbol" w:hint="default"/>
       </w:rPr>
     </w:lvl>
     <w:lvl w:ilvl="4" w:tplc="04160003" w:tentative="1">
@@ -2481,7 +2164,7 @@
         <w:ind w:left="3600" w:hanging="360"/>
       </w:pPr>
       <w:rPr>
-        <w:rFonts w:hint="default" w:ascii="Courier New" w:hAnsi="Courier New" w:cs="Courier New"/>
+        <w:rFonts w:ascii="Courier New" w:hAnsi="Courier New" w:cs="Courier New" w:hint="default"/>
       </w:rPr>
     </w:lvl>
     <w:lvl w:ilvl="5" w:tplc="04160005" w:tentative="1">
@@ -2493,7 +2176,7 @@
         <w:ind w:left="4320" w:hanging="360"/>
       </w:pPr>
       <w:rPr>
-        <w:rFonts w:hint="default" w:ascii="Wingdings" w:hAnsi="Wingdings"/>
+        <w:rFonts w:ascii="Wingdings" w:hAnsi="Wingdings" w:hint="default"/>
       </w:rPr>
     </w:lvl>
     <w:lvl w:ilvl="6" w:tplc="04160001" w:tentative="1">
@@ -2505,7 +2188,7 @@
         <w:ind w:left="5040" w:hanging="360"/>
       </w:pPr>
       <w:rPr>
-        <w:rFonts w:hint="default" w:ascii="Symbol" w:hAnsi="Symbol"/>
+        <w:rFonts w:ascii="Symbol" w:hAnsi="Symbol" w:hint="default"/>
       </w:rPr>
     </w:lvl>
     <w:lvl w:ilvl="7" w:tplc="04160003" w:tentative="1">
@@ -2517,7 +2200,7 @@
         <w:ind w:left="5760" w:hanging="360"/>
       </w:pPr>
       <w:rPr>
-        <w:rFonts w:hint="default" w:ascii="Courier New" w:hAnsi="Courier New" w:cs="Courier New"/>
+        <w:rFonts w:ascii="Courier New" w:hAnsi="Courier New" w:cs="Courier New" w:hint="default"/>
       </w:rPr>
     </w:lvl>
     <w:lvl w:ilvl="8" w:tplc="04160005" w:tentative="1">
@@ -2529,7 +2212,7 @@
         <w:ind w:left="6480" w:hanging="360"/>
       </w:pPr>
       <w:rPr>
-        <w:rFonts w:hint="default" w:ascii="Wingdings" w:hAnsi="Wingdings"/>
+        <w:rFonts w:ascii="Wingdings" w:hAnsi="Wingdings" w:hint="default"/>
       </w:rPr>
     </w:lvl>
   </w:abstractNum>
@@ -2589,7 +2272,7 @@
   <w:docDefaults>
     <w:rPrDefault>
       <w:rPr>
-        <w:rFonts w:asciiTheme="minorHAnsi" w:hAnsiTheme="minorHAnsi" w:eastAsiaTheme="minorHAnsi" w:cstheme="minorBidi"/>
+        <w:rFonts w:asciiTheme="minorHAnsi" w:eastAsiaTheme="minorHAnsi" w:hAnsiTheme="minorHAnsi" w:cstheme="minorBidi"/>
         <w:kern w:val="2"/>
         <w:sz w:val="24"/>
         <w:szCs w:val="24"/>
@@ -2606,14 +2289,14 @@
   <w:latentStyles w:defLockedState="0" w:defUIPriority="99" w:defSemiHidden="0" w:defUnhideWhenUsed="0" w:defQFormat="0" w:count="376">
     <w:lsdException w:name="Normal" w:uiPriority="0" w:qFormat="1"/>
     <w:lsdException w:name="heading 1" w:uiPriority="9" w:qFormat="1"/>
-    <w:lsdException w:name="heading 2" w:uiPriority="9" w:semiHidden="1" w:unhideWhenUsed="1" w:qFormat="1"/>
-    <w:lsdException w:name="heading 3" w:uiPriority="9" w:semiHidden="1" w:unhideWhenUsed="1" w:qFormat="1"/>
-    <w:lsdException w:name="heading 4" w:uiPriority="9" w:semiHidden="1" w:unhideWhenUsed="1" w:qFormat="1"/>
-    <w:lsdException w:name="heading 5" w:uiPriority="9" w:semiHidden="1" w:unhideWhenUsed="1" w:qFormat="1"/>
-    <w:lsdException w:name="heading 6" w:uiPriority="9" w:semiHidden="1" w:unhideWhenUsed="1" w:qFormat="1"/>
-    <w:lsdException w:name="heading 7" w:uiPriority="9" w:semiHidden="1" w:unhideWhenUsed="1" w:qFormat="1"/>
-    <w:lsdException w:name="heading 8" w:uiPriority="9" w:semiHidden="1" w:unhideWhenUsed="1" w:qFormat="1"/>
-    <w:lsdException w:name="heading 9" w:uiPriority="9" w:semiHidden="1" w:unhideWhenUsed="1" w:qFormat="1"/>
+    <w:lsdException w:name="heading 2" w:semiHidden="1" w:uiPriority="9" w:unhideWhenUsed="1" w:qFormat="1"/>
+    <w:lsdException w:name="heading 3" w:semiHidden="1" w:uiPriority="9" w:unhideWhenUsed="1" w:qFormat="1"/>
+    <w:lsdException w:name="heading 4" w:semiHidden="1" w:uiPriority="9" w:unhideWhenUsed="1" w:qFormat="1"/>
+    <w:lsdException w:name="heading 5" w:semiHidden="1" w:uiPriority="9" w:unhideWhenUsed="1" w:qFormat="1"/>
+    <w:lsdException w:name="heading 6" w:semiHidden="1" w:uiPriority="9" w:unhideWhenUsed="1" w:qFormat="1"/>
+    <w:lsdException w:name="heading 7" w:semiHidden="1" w:uiPriority="9" w:unhideWhenUsed="1" w:qFormat="1"/>
+    <w:lsdException w:name="heading 8" w:semiHidden="1" w:uiPriority="9" w:unhideWhenUsed="1" w:qFormat="1"/>
+    <w:lsdException w:name="heading 9" w:semiHidden="1" w:uiPriority="9" w:unhideWhenUsed="1" w:qFormat="1"/>
     <w:lsdException w:name="index 1" w:semiHidden="1" w:unhideWhenUsed="1"/>
     <w:lsdException w:name="index 2" w:semiHidden="1" w:unhideWhenUsed="1"/>
     <w:lsdException w:name="index 3" w:semiHidden="1" w:unhideWhenUsed="1"/>
@@ -2623,22 +2306,22 @@
     <w:lsdException w:name="index 7" w:semiHidden="1" w:unhideWhenUsed="1"/>
     <w:lsdException w:name="index 8" w:semiHidden="1" w:unhideWhenUsed="1"/>
     <w:lsdException w:name="index 9" w:semiHidden="1" w:unhideWhenUsed="1"/>
-    <w:lsdException w:name="toc 1" w:uiPriority="39" w:semiHidden="1" w:unhideWhenUsed="1"/>
-    <w:lsdException w:name="toc 2" w:uiPriority="39" w:semiHidden="1" w:unhideWhenUsed="1"/>
-    <w:lsdException w:name="toc 3" w:uiPriority="39" w:semiHidden="1" w:unhideWhenUsed="1"/>
-    <w:lsdException w:name="toc 4" w:uiPriority="39" w:semiHidden="1" w:unhideWhenUsed="1"/>
-    <w:lsdException w:name="toc 5" w:uiPriority="39" w:semiHidden="1" w:unhideWhenUsed="1"/>
-    <w:lsdException w:name="toc 6" w:uiPriority="39" w:semiHidden="1" w:unhideWhenUsed="1"/>
-    <w:lsdException w:name="toc 7" w:uiPriority="39" w:semiHidden="1" w:unhideWhenUsed="1"/>
-    <w:lsdException w:name="toc 8" w:uiPriority="39" w:semiHidden="1" w:unhideWhenUsed="1"/>
-    <w:lsdException w:name="toc 9" w:uiPriority="39" w:semiHidden="1" w:unhideWhenUsed="1"/>
+    <w:lsdException w:name="toc 1" w:semiHidden="1" w:uiPriority="39" w:unhideWhenUsed="1"/>
+    <w:lsdException w:name="toc 2" w:semiHidden="1" w:uiPriority="39" w:unhideWhenUsed="1"/>
+    <w:lsdException w:name="toc 3" w:semiHidden="1" w:uiPriority="39" w:unhideWhenUsed="1"/>
+    <w:lsdException w:name="toc 4" w:semiHidden="1" w:uiPriority="39" w:unhideWhenUsed="1"/>
+    <w:lsdException w:name="toc 5" w:semiHidden="1" w:uiPriority="39" w:unhideWhenUsed="1"/>
+    <w:lsdException w:name="toc 6" w:semiHidden="1" w:uiPriority="39" w:unhideWhenUsed="1"/>
+    <w:lsdException w:name="toc 7" w:semiHidden="1" w:uiPriority="39" w:unhideWhenUsed="1"/>
+    <w:lsdException w:name="toc 8" w:semiHidden="1" w:uiPriority="39" w:unhideWhenUsed="1"/>
+    <w:lsdException w:name="toc 9" w:semiHidden="1" w:uiPriority="39" w:unhideWhenUsed="1"/>
     <w:lsdException w:name="Normal Indent" w:semiHidden="1" w:unhideWhenUsed="1"/>
     <w:lsdException w:name="footnote text" w:semiHidden="1" w:unhideWhenUsed="1"/>
     <w:lsdException w:name="annotation text" w:semiHidden="1" w:unhideWhenUsed="1"/>
-    <w:lsdException w:name="header" w:uiPriority="0" w:semiHidden="1" w:unhideWhenUsed="1"/>
+    <w:lsdException w:name="header" w:semiHidden="1" w:uiPriority="0" w:unhideWhenUsed="1"/>
     <w:lsdException w:name="footer" w:semiHidden="1" w:unhideWhenUsed="1"/>
     <w:lsdException w:name="index heading" w:semiHidden="1" w:unhideWhenUsed="1"/>
-    <w:lsdException w:name="caption" w:uiPriority="35" w:semiHidden="1" w:unhideWhenUsed="1" w:qFormat="1"/>
+    <w:lsdException w:name="caption" w:semiHidden="1" w:uiPriority="35" w:unhideWhenUsed="1" w:qFormat="1"/>
     <w:lsdException w:name="table of figures" w:semiHidden="1" w:unhideWhenUsed="1"/>
     <w:lsdException w:name="envelope address" w:semiHidden="1" w:unhideWhenUsed="1"/>
     <w:lsdException w:name="envelope return" w:semiHidden="1" w:unhideWhenUsed="1"/>
@@ -2669,7 +2352,7 @@
     <w:lsdException w:name="Title" w:uiPriority="10" w:qFormat="1"/>
     <w:lsdException w:name="Closing" w:semiHidden="1" w:unhideWhenUsed="1"/>
     <w:lsdException w:name="Signature" w:semiHidden="1" w:unhideWhenUsed="1"/>
-    <w:lsdException w:name="Default Paragraph Font" w:uiPriority="1" w:semiHidden="1" w:unhideWhenUsed="1"/>
+    <w:lsdException w:name="Default Paragraph Font" w:semiHidden="1" w:uiPriority="1" w:unhideWhenUsed="1"/>
     <w:lsdException w:name="Body Text" w:semiHidden="1" w:unhideWhenUsed="1"/>
     <w:lsdException w:name="Body Text Indent" w:semiHidden="1" w:unhideWhenUsed="1"/>
     <w:lsdException w:name="List Continue" w:semiHidden="1" w:unhideWhenUsed="1"/>
@@ -2684,7 +2367,7 @@
     <w:lsdException w:name="Body Text First Indent" w:semiHidden="1" w:unhideWhenUsed="1"/>
     <w:lsdException w:name="Body Text First Indent 2" w:semiHidden="1" w:unhideWhenUsed="1"/>
     <w:lsdException w:name="Note Heading" w:semiHidden="1" w:unhideWhenUsed="1"/>
-    <w:lsdException w:name="Body Text 2" w:uiPriority="0" w:semiHidden="1" w:unhideWhenUsed="1"/>
+    <w:lsdException w:name="Body Text 2" w:semiHidden="1" w:uiPriority="0" w:unhideWhenUsed="1"/>
     <w:lsdException w:name="Body Text 3" w:semiHidden="1" w:unhideWhenUsed="1"/>
     <w:lsdException w:name="Body Text Indent 2" w:semiHidden="1" w:unhideWhenUsed="1"/>
     <w:lsdException w:name="Body Text Indent 3" w:semiHidden="1" w:unhideWhenUsed="1"/>
@@ -2869,8 +2552,8 @@
     <w:lsdException w:name="Subtle Reference" w:uiPriority="31" w:qFormat="1"/>
     <w:lsdException w:name="Intense Reference" w:uiPriority="32" w:qFormat="1"/>
     <w:lsdException w:name="Book Title" w:uiPriority="33" w:qFormat="1"/>
-    <w:lsdException w:name="Bibliography" w:uiPriority="37" w:semiHidden="1" w:unhideWhenUsed="1"/>
-    <w:lsdException w:name="TOC Heading" w:uiPriority="39" w:semiHidden="1" w:unhideWhenUsed="1" w:qFormat="1"/>
+    <w:lsdException w:name="Bibliography" w:semiHidden="1" w:uiPriority="37" w:unhideWhenUsed="1"/>
+    <w:lsdException w:name="TOC Heading" w:semiHidden="1" w:uiPriority="39" w:unhideWhenUsed="1" w:qFormat="1"/>
     <w:lsdException w:name="Plain Table 1" w:uiPriority="41"/>
     <w:lsdException w:name="Plain Table 2" w:uiPriority="42"/>
     <w:lsdException w:name="Plain Table 3" w:uiPriority="43"/>
@@ -2981,7 +2664,7 @@
     <w:lsdException w:name="Unresolved Mention" w:semiHidden="1" w:unhideWhenUsed="1"/>
     <w:lsdException w:name="Smart Link" w:semiHidden="1" w:unhideWhenUsed="1"/>
   </w:latentStyles>
-  <w:style w:type="paragraph" w:styleId="Normal" w:default="1">
+  <w:style w:type="paragraph" w:default="1" w:styleId="Normal">
     <w:name w:val="Normal"/>
     <w:qFormat/>
     <w:rsid w:val="0026455E"/>
@@ -2989,7 +2672,7 @@
       <w:spacing w:after="0" w:line="240" w:lineRule="auto"/>
     </w:pPr>
     <w:rPr>
-      <w:rFonts w:ascii="Times New Roman" w:hAnsi="Times New Roman" w:eastAsia="Times New Roman" w:cs="Times New Roman"/>
+      <w:rFonts w:ascii="Times New Roman" w:eastAsia="Times New Roman" w:hAnsi="Times New Roman" w:cs="Times New Roman"/>
       <w:kern w:val="0"/>
       <w:sz w:val="20"/>
       <w:szCs w:val="20"/>
@@ -2997,11 +2680,11 @@
       <w14:ligatures w14:val="none"/>
     </w:rPr>
   </w:style>
-  <w:style w:type="paragraph" w:styleId="Ttulo1">
+  <w:style w:type="paragraph" w:styleId="Heading1">
     <w:name w:val="heading 1"/>
     <w:basedOn w:val="Normal"/>
     <w:next w:val="Normal"/>
-    <w:link w:val="Ttulo1Char"/>
+    <w:link w:val="Heading1Char"/>
     <w:uiPriority w:val="9"/>
     <w:qFormat/>
     <w:rsid w:val="0026455E"/>
@@ -3012,17 +2695,17 @@
       <w:outlineLvl w:val="0"/>
     </w:pPr>
     <w:rPr>
-      <w:rFonts w:asciiTheme="majorHAnsi" w:hAnsiTheme="majorHAnsi" w:eastAsiaTheme="majorEastAsia" w:cstheme="majorBidi"/>
+      <w:rFonts w:asciiTheme="majorHAnsi" w:eastAsiaTheme="majorEastAsia" w:hAnsiTheme="majorHAnsi" w:cstheme="majorBidi"/>
       <w:color w:val="0F4761" w:themeColor="accent1" w:themeShade="BF"/>
       <w:sz w:val="40"/>
       <w:szCs w:val="40"/>
     </w:rPr>
   </w:style>
-  <w:style w:type="paragraph" w:styleId="Ttulo2">
+  <w:style w:type="paragraph" w:styleId="Heading2">
     <w:name w:val="heading 2"/>
     <w:basedOn w:val="Normal"/>
     <w:next w:val="Normal"/>
-    <w:link w:val="Ttulo2Char"/>
+    <w:link w:val="Heading2Char"/>
     <w:uiPriority w:val="9"/>
     <w:semiHidden/>
     <w:unhideWhenUsed/>
@@ -3035,17 +2718,17 @@
       <w:outlineLvl w:val="1"/>
     </w:pPr>
     <w:rPr>
-      <w:rFonts w:asciiTheme="majorHAnsi" w:hAnsiTheme="majorHAnsi" w:eastAsiaTheme="majorEastAsia" w:cstheme="majorBidi"/>
+      <w:rFonts w:asciiTheme="majorHAnsi" w:eastAsiaTheme="majorEastAsia" w:hAnsiTheme="majorHAnsi" w:cstheme="majorBidi"/>
       <w:color w:val="0F4761" w:themeColor="accent1" w:themeShade="BF"/>
       <w:sz w:val="32"/>
       <w:szCs w:val="32"/>
     </w:rPr>
   </w:style>
-  <w:style w:type="paragraph" w:styleId="Ttulo3">
+  <w:style w:type="paragraph" w:styleId="Heading3">
     <w:name w:val="heading 3"/>
     <w:basedOn w:val="Normal"/>
     <w:next w:val="Normal"/>
-    <w:link w:val="Ttulo3Char"/>
+    <w:link w:val="Heading3Char"/>
     <w:uiPriority w:val="9"/>
     <w:semiHidden/>
     <w:unhideWhenUsed/>
@@ -3064,11 +2747,11 @@
       <w:szCs w:val="28"/>
     </w:rPr>
   </w:style>
-  <w:style w:type="paragraph" w:styleId="Ttulo4">
+  <w:style w:type="paragraph" w:styleId="Heading4">
     <w:name w:val="heading 4"/>
     <w:basedOn w:val="Normal"/>
     <w:next w:val="Normal"/>
-    <w:link w:val="Ttulo4Char"/>
+    <w:link w:val="Heading4Char"/>
     <w:uiPriority w:val="9"/>
     <w:semiHidden/>
     <w:unhideWhenUsed/>
@@ -3087,11 +2770,11 @@
       <w:color w:val="0F4761" w:themeColor="accent1" w:themeShade="BF"/>
     </w:rPr>
   </w:style>
-  <w:style w:type="paragraph" w:styleId="Ttulo5">
+  <w:style w:type="paragraph" w:styleId="Heading5">
     <w:name w:val="heading 5"/>
     <w:basedOn w:val="Normal"/>
     <w:next w:val="Normal"/>
-    <w:link w:val="Ttulo5Char"/>
+    <w:link w:val="Heading5Char"/>
     <w:uiPriority w:val="9"/>
     <w:semiHidden/>
     <w:unhideWhenUsed/>
@@ -3108,11 +2791,11 @@
       <w:color w:val="0F4761" w:themeColor="accent1" w:themeShade="BF"/>
     </w:rPr>
   </w:style>
-  <w:style w:type="paragraph" w:styleId="Ttulo6">
+  <w:style w:type="paragraph" w:styleId="Heading6">
     <w:name w:val="heading 6"/>
     <w:basedOn w:val="Normal"/>
     <w:next w:val="Normal"/>
-    <w:link w:val="Ttulo6Char"/>
+    <w:link w:val="Heading6Char"/>
     <w:uiPriority w:val="9"/>
     <w:semiHidden/>
     <w:unhideWhenUsed/>
@@ -3131,11 +2814,11 @@
       <w:color w:val="595959" w:themeColor="text1" w:themeTint="A6"/>
     </w:rPr>
   </w:style>
-  <w:style w:type="paragraph" w:styleId="Ttulo7">
+  <w:style w:type="paragraph" w:styleId="Heading7">
     <w:name w:val="heading 7"/>
     <w:basedOn w:val="Normal"/>
     <w:next w:val="Normal"/>
-    <w:link w:val="Ttulo7Char"/>
+    <w:link w:val="Heading7Char"/>
     <w:uiPriority w:val="9"/>
     <w:semiHidden/>
     <w:unhideWhenUsed/>
@@ -3152,11 +2835,11 @@
       <w:color w:val="595959" w:themeColor="text1" w:themeTint="A6"/>
     </w:rPr>
   </w:style>
-  <w:style w:type="paragraph" w:styleId="Ttulo8">
+  <w:style w:type="paragraph" w:styleId="Heading8">
     <w:name w:val="heading 8"/>
     <w:basedOn w:val="Normal"/>
     <w:next w:val="Normal"/>
-    <w:link w:val="Ttulo8Char"/>
+    <w:link w:val="Heading8Char"/>
     <w:uiPriority w:val="9"/>
     <w:semiHidden/>
     <w:unhideWhenUsed/>
@@ -3174,11 +2857,11 @@
       <w:color w:val="272727" w:themeColor="text1" w:themeTint="D8"/>
     </w:rPr>
   </w:style>
-  <w:style w:type="paragraph" w:styleId="Ttulo9">
+  <w:style w:type="paragraph" w:styleId="Heading9">
     <w:name w:val="heading 9"/>
     <w:basedOn w:val="Normal"/>
     <w:next w:val="Normal"/>
-    <w:link w:val="Ttulo9Char"/>
+    <w:link w:val="Heading9Char"/>
     <w:uiPriority w:val="9"/>
     <w:semiHidden/>
     <w:unhideWhenUsed/>
@@ -3194,13 +2877,13 @@
       <w:color w:val="272727" w:themeColor="text1" w:themeTint="D8"/>
     </w:rPr>
   </w:style>
-  <w:style w:type="character" w:styleId="Fontepargpadro" w:default="1">
+  <w:style w:type="character" w:default="1" w:styleId="DefaultParagraphFont">
     <w:name w:val="Default Paragraph Font"/>
     <w:uiPriority w:val="1"/>
     <w:semiHidden/>
     <w:unhideWhenUsed/>
   </w:style>
-  <w:style w:type="table" w:styleId="Tabelanormal" w:default="1">
+  <w:style w:type="table" w:default="1" w:styleId="TableNormal">
     <w:name w:val="Normal Table"/>
     <w:uiPriority w:val="99"/>
     <w:semiHidden/>
@@ -3215,43 +2898,43 @@
       </w:tblCellMar>
     </w:tblPr>
   </w:style>
-  <w:style w:type="numbering" w:styleId="Semlista" w:default="1">
+  <w:style w:type="numbering" w:default="1" w:styleId="NoList">
     <w:name w:val="No List"/>
     <w:uiPriority w:val="99"/>
     <w:semiHidden/>
     <w:unhideWhenUsed/>
   </w:style>
-  <w:style w:type="character" w:styleId="Ttulo1Char" w:customStyle="1">
-    <w:name w:val="Título 1 Char"/>
-    <w:basedOn w:val="Fontepargpadro"/>
-    <w:link w:val="Ttulo1"/>
+  <w:style w:type="character" w:customStyle="1" w:styleId="Heading1Char">
+    <w:name w:val="Heading 1 Char"/>
+    <w:basedOn w:val="DefaultParagraphFont"/>
+    <w:link w:val="Heading1"/>
     <w:uiPriority w:val="9"/>
     <w:rsid w:val="0026455E"/>
     <w:rPr>
-      <w:rFonts w:asciiTheme="majorHAnsi" w:hAnsiTheme="majorHAnsi" w:eastAsiaTheme="majorEastAsia" w:cstheme="majorBidi"/>
+      <w:rFonts w:asciiTheme="majorHAnsi" w:eastAsiaTheme="majorEastAsia" w:hAnsiTheme="majorHAnsi" w:cstheme="majorBidi"/>
       <w:color w:val="0F4761" w:themeColor="accent1" w:themeShade="BF"/>
       <w:sz w:val="40"/>
       <w:szCs w:val="40"/>
     </w:rPr>
   </w:style>
-  <w:style w:type="character" w:styleId="Ttulo2Char" w:customStyle="1">
-    <w:name w:val="Título 2 Char"/>
-    <w:basedOn w:val="Fontepargpadro"/>
-    <w:link w:val="Ttulo2"/>
+  <w:style w:type="character" w:customStyle="1" w:styleId="Heading2Char">
+    <w:name w:val="Heading 2 Char"/>
+    <w:basedOn w:val="DefaultParagraphFont"/>
+    <w:link w:val="Heading2"/>
     <w:uiPriority w:val="9"/>
     <w:semiHidden/>
     <w:rsid w:val="0026455E"/>
     <w:rPr>
-      <w:rFonts w:asciiTheme="majorHAnsi" w:hAnsiTheme="majorHAnsi" w:eastAsiaTheme="majorEastAsia" w:cstheme="majorBidi"/>
+      <w:rFonts w:asciiTheme="majorHAnsi" w:eastAsiaTheme="majorEastAsia" w:hAnsiTheme="majorHAnsi" w:cstheme="majorBidi"/>
       <w:color w:val="0F4761" w:themeColor="accent1" w:themeShade="BF"/>
       <w:sz w:val="32"/>
       <w:szCs w:val="32"/>
     </w:rPr>
   </w:style>
-  <w:style w:type="character" w:styleId="Ttulo3Char" w:customStyle="1">
-    <w:name w:val="Título 3 Char"/>
-    <w:basedOn w:val="Fontepargpadro"/>
-    <w:link w:val="Ttulo3"/>
+  <w:style w:type="character" w:customStyle="1" w:styleId="Heading3Char">
+    <w:name w:val="Heading 3 Char"/>
+    <w:basedOn w:val="DefaultParagraphFont"/>
+    <w:link w:val="Heading3"/>
     <w:uiPriority w:val="9"/>
     <w:semiHidden/>
     <w:rsid w:val="0026455E"/>
@@ -3262,10 +2945,10 @@
       <w:szCs w:val="28"/>
     </w:rPr>
   </w:style>
-  <w:style w:type="character" w:styleId="Ttulo4Char" w:customStyle="1">
-    <w:name w:val="Título 4 Char"/>
-    <w:basedOn w:val="Fontepargpadro"/>
-    <w:link w:val="Ttulo4"/>
+  <w:style w:type="character" w:customStyle="1" w:styleId="Heading4Char">
+    <w:name w:val="Heading 4 Char"/>
+    <w:basedOn w:val="DefaultParagraphFont"/>
+    <w:link w:val="Heading4"/>
     <w:uiPriority w:val="9"/>
     <w:semiHidden/>
     <w:rsid w:val="0026455E"/>
@@ -3276,10 +2959,10 @@
       <w:color w:val="0F4761" w:themeColor="accent1" w:themeShade="BF"/>
     </w:rPr>
   </w:style>
-  <w:style w:type="character" w:styleId="Ttulo5Char" w:customStyle="1">
-    <w:name w:val="Título 5 Char"/>
-    <w:basedOn w:val="Fontepargpadro"/>
-    <w:link w:val="Ttulo5"/>
+  <w:style w:type="character" w:customStyle="1" w:styleId="Heading5Char">
+    <w:name w:val="Heading 5 Char"/>
+    <w:basedOn w:val="DefaultParagraphFont"/>
+    <w:link w:val="Heading5"/>
     <w:uiPriority w:val="9"/>
     <w:semiHidden/>
     <w:rsid w:val="0026455E"/>
@@ -3288,10 +2971,10 @@
       <w:color w:val="0F4761" w:themeColor="accent1" w:themeShade="BF"/>
     </w:rPr>
   </w:style>
-  <w:style w:type="character" w:styleId="Ttulo6Char" w:customStyle="1">
-    <w:name w:val="Título 6 Char"/>
-    <w:basedOn w:val="Fontepargpadro"/>
-    <w:link w:val="Ttulo6"/>
+  <w:style w:type="character" w:customStyle="1" w:styleId="Heading6Char">
+    <w:name w:val="Heading 6 Char"/>
+    <w:basedOn w:val="DefaultParagraphFont"/>
+    <w:link w:val="Heading6"/>
     <w:uiPriority w:val="9"/>
     <w:semiHidden/>
     <w:rsid w:val="0026455E"/>
@@ -3302,10 +2985,10 @@
       <w:color w:val="595959" w:themeColor="text1" w:themeTint="A6"/>
     </w:rPr>
   </w:style>
-  <w:style w:type="character" w:styleId="Ttulo7Char" w:customStyle="1">
-    <w:name w:val="Título 7 Char"/>
-    <w:basedOn w:val="Fontepargpadro"/>
-    <w:link w:val="Ttulo7"/>
+  <w:style w:type="character" w:customStyle="1" w:styleId="Heading7Char">
+    <w:name w:val="Heading 7 Char"/>
+    <w:basedOn w:val="DefaultParagraphFont"/>
+    <w:link w:val="Heading7"/>
     <w:uiPriority w:val="9"/>
     <w:semiHidden/>
     <w:rsid w:val="0026455E"/>
@@ -3314,10 +2997,10 @@
       <w:color w:val="595959" w:themeColor="text1" w:themeTint="A6"/>
     </w:rPr>
   </w:style>
-  <w:style w:type="character" w:styleId="Ttulo8Char" w:customStyle="1">
-    <w:name w:val="Título 8 Char"/>
-    <w:basedOn w:val="Fontepargpadro"/>
-    <w:link w:val="Ttulo8"/>
+  <w:style w:type="character" w:customStyle="1" w:styleId="Heading8Char">
+    <w:name w:val="Heading 8 Char"/>
+    <w:basedOn w:val="DefaultParagraphFont"/>
+    <w:link w:val="Heading8"/>
     <w:uiPriority w:val="9"/>
     <w:semiHidden/>
     <w:rsid w:val="0026455E"/>
@@ -3328,10 +3011,10 @@
       <w:color w:val="272727" w:themeColor="text1" w:themeTint="D8"/>
     </w:rPr>
   </w:style>
-  <w:style w:type="character" w:styleId="Ttulo9Char" w:customStyle="1">
-    <w:name w:val="Título 9 Char"/>
-    <w:basedOn w:val="Fontepargpadro"/>
-    <w:link w:val="Ttulo9"/>
+  <w:style w:type="character" w:customStyle="1" w:styleId="Heading9Char">
+    <w:name w:val="Heading 9 Char"/>
+    <w:basedOn w:val="DefaultParagraphFont"/>
+    <w:link w:val="Heading9"/>
     <w:uiPriority w:val="9"/>
     <w:semiHidden/>
     <w:rsid w:val="0026455E"/>
@@ -3340,11 +3023,11 @@
       <w:color w:val="272727" w:themeColor="text1" w:themeTint="D8"/>
     </w:rPr>
   </w:style>
-  <w:style w:type="paragraph" w:styleId="Ttulo">
+  <w:style w:type="paragraph" w:styleId="Title">
     <w:name w:val="Title"/>
     <w:basedOn w:val="Normal"/>
     <w:next w:val="Normal"/>
-    <w:link w:val="TtuloChar"/>
+    <w:link w:val="TitleChar"/>
     <w:uiPriority w:val="10"/>
     <w:qFormat/>
     <w:rsid w:val="0026455E"/>
@@ -3353,32 +3036,32 @@
       <w:contextualSpacing/>
     </w:pPr>
     <w:rPr>
-      <w:rFonts w:asciiTheme="majorHAnsi" w:hAnsiTheme="majorHAnsi" w:eastAsiaTheme="majorEastAsia" w:cstheme="majorBidi"/>
+      <w:rFonts w:asciiTheme="majorHAnsi" w:eastAsiaTheme="majorEastAsia" w:hAnsiTheme="majorHAnsi" w:cstheme="majorBidi"/>
       <w:spacing w:val="-10"/>
       <w:kern w:val="28"/>
       <w:sz w:val="56"/>
       <w:szCs w:val="56"/>
     </w:rPr>
   </w:style>
-  <w:style w:type="character" w:styleId="TtuloChar" w:customStyle="1">
-    <w:name w:val="Título Char"/>
-    <w:basedOn w:val="Fontepargpadro"/>
-    <w:link w:val="Ttulo"/>
+  <w:style w:type="character" w:customStyle="1" w:styleId="TitleChar">
+    <w:name w:val="Title Char"/>
+    <w:basedOn w:val="DefaultParagraphFont"/>
+    <w:link w:val="Title"/>
     <w:uiPriority w:val="10"/>
     <w:rsid w:val="0026455E"/>
     <w:rPr>
-      <w:rFonts w:asciiTheme="majorHAnsi" w:hAnsiTheme="majorHAnsi" w:eastAsiaTheme="majorEastAsia" w:cstheme="majorBidi"/>
+      <w:rFonts w:asciiTheme="majorHAnsi" w:eastAsiaTheme="majorEastAsia" w:hAnsiTheme="majorHAnsi" w:cstheme="majorBidi"/>
       <w:spacing w:val="-10"/>
       <w:kern w:val="28"/>
       <w:sz w:val="56"/>
       <w:szCs w:val="56"/>
     </w:rPr>
   </w:style>
-  <w:style w:type="paragraph" w:styleId="Subttulo">
+  <w:style w:type="paragraph" w:styleId="Subtitle">
     <w:name w:val="Subtitle"/>
     <w:basedOn w:val="Normal"/>
     <w:next w:val="Normal"/>
-    <w:link w:val="SubttuloChar"/>
+    <w:link w:val="SubtitleChar"/>
     <w:uiPriority w:val="11"/>
     <w:qFormat/>
     <w:rsid w:val="0026455E"/>
@@ -3395,10 +3078,10 @@
       <w:szCs w:val="28"/>
     </w:rPr>
   </w:style>
-  <w:style w:type="character" w:styleId="SubttuloChar" w:customStyle="1">
-    <w:name w:val="Subtítulo Char"/>
-    <w:basedOn w:val="Fontepargpadro"/>
-    <w:link w:val="Subttulo"/>
+  <w:style w:type="character" w:customStyle="1" w:styleId="SubtitleChar">
+    <w:name w:val="Subtitle Char"/>
+    <w:basedOn w:val="DefaultParagraphFont"/>
+    <w:link w:val="Subtitle"/>
     <w:uiPriority w:val="11"/>
     <w:rsid w:val="0026455E"/>
     <w:rPr>
@@ -3409,11 +3092,11 @@
       <w:szCs w:val="28"/>
     </w:rPr>
   </w:style>
-  <w:style w:type="paragraph" w:styleId="Citao">
+  <w:style w:type="paragraph" w:styleId="Quote">
     <w:name w:val="Quote"/>
     <w:basedOn w:val="Normal"/>
     <w:next w:val="Normal"/>
-    <w:link w:val="CitaoChar"/>
+    <w:link w:val="QuoteChar"/>
     <w:uiPriority w:val="29"/>
     <w:qFormat/>
     <w:rsid w:val="0026455E"/>
@@ -3427,10 +3110,10 @@
       <w:color w:val="404040" w:themeColor="text1" w:themeTint="BF"/>
     </w:rPr>
   </w:style>
-  <w:style w:type="character" w:styleId="CitaoChar" w:customStyle="1">
-    <w:name w:val="Citação Char"/>
-    <w:basedOn w:val="Fontepargpadro"/>
-    <w:link w:val="Citao"/>
+  <w:style w:type="character" w:customStyle="1" w:styleId="QuoteChar">
+    <w:name w:val="Quote Char"/>
+    <w:basedOn w:val="DefaultParagraphFont"/>
+    <w:link w:val="Quote"/>
     <w:uiPriority w:val="29"/>
     <w:rsid w:val="0026455E"/>
     <w:rPr>
@@ -3439,7 +3122,7 @@
       <w:color w:val="404040" w:themeColor="text1" w:themeTint="BF"/>
     </w:rPr>
   </w:style>
-  <w:style w:type="paragraph" w:styleId="PargrafodaLista">
+  <w:style w:type="paragraph" w:styleId="ListParagraph">
     <w:name w:val="List Paragraph"/>
     <w:basedOn w:val="Normal"/>
     <w:uiPriority w:val="34"/>
@@ -3450,9 +3133,9 @@
       <w:contextualSpacing/>
     </w:pPr>
   </w:style>
-  <w:style w:type="character" w:styleId="nfaseIntensa">
+  <w:style w:type="character" w:styleId="IntenseEmphasis">
     <w:name w:val="Intense Emphasis"/>
-    <w:basedOn w:val="Fontepargpadro"/>
+    <w:basedOn w:val="DefaultParagraphFont"/>
     <w:uiPriority w:val="21"/>
     <w:qFormat/>
     <w:rsid w:val="0026455E"/>
@@ -3462,18 +3145,18 @@
       <w:color w:val="0F4761" w:themeColor="accent1" w:themeShade="BF"/>
     </w:rPr>
   </w:style>
-  <w:style w:type="paragraph" w:styleId="CitaoIntensa">
+  <w:style w:type="paragraph" w:styleId="IntenseQuote">
     <w:name w:val="Intense Quote"/>
     <w:basedOn w:val="Normal"/>
     <w:next w:val="Normal"/>
-    <w:link w:val="CitaoIntensaChar"/>
+    <w:link w:val="IntenseQuoteChar"/>
     <w:uiPriority w:val="30"/>
     <w:qFormat/>
     <w:rsid w:val="0026455E"/>
     <w:pPr>
       <w:pBdr>
-        <w:top w:val="single" w:color="0F4761" w:themeColor="accent1" w:themeShade="BF" w:sz="4" w:space="10"/>
-        <w:bottom w:val="single" w:color="0F4761" w:themeColor="accent1" w:themeShade="BF" w:sz="4" w:space="10"/>
+        <w:top w:val="single" w:sz="4" w:space="10" w:color="0F4761" w:themeColor="accent1" w:themeShade="BF"/>
+        <w:bottom w:val="single" w:sz="4" w:space="10" w:color="0F4761" w:themeColor="accent1" w:themeShade="BF"/>
       </w:pBdr>
       <w:spacing w:before="360" w:after="360"/>
       <w:ind w:left="864" w:right="864"/>
@@ -3485,10 +3168,10 @@
       <w:color w:val="0F4761" w:themeColor="accent1" w:themeShade="BF"/>
     </w:rPr>
   </w:style>
-  <w:style w:type="character" w:styleId="CitaoIntensaChar" w:customStyle="1">
-    <w:name w:val="Citação Intensa Char"/>
-    <w:basedOn w:val="Fontepargpadro"/>
-    <w:link w:val="CitaoIntensa"/>
+  <w:style w:type="character" w:customStyle="1" w:styleId="IntenseQuoteChar">
+    <w:name w:val="Intense Quote Char"/>
+    <w:basedOn w:val="DefaultParagraphFont"/>
+    <w:link w:val="IntenseQuote"/>
     <w:uiPriority w:val="30"/>
     <w:rsid w:val="0026455E"/>
     <w:rPr>
@@ -3497,9 +3180,9 @@
       <w:color w:val="0F4761" w:themeColor="accent1" w:themeShade="BF"/>
     </w:rPr>
   </w:style>
-  <w:style w:type="character" w:styleId="RefernciaIntensa">
+  <w:style w:type="character" w:styleId="IntenseReference">
     <w:name w:val="Intense Reference"/>
-    <w:basedOn w:val="Fontepargpadro"/>
+    <w:basedOn w:val="DefaultParagraphFont"/>
     <w:uiPriority w:val="32"/>
     <w:qFormat/>
     <w:rsid w:val="0026455E"/>
@@ -3511,22 +3194,22 @@
       <w:spacing w:val="5"/>
     </w:rPr>
   </w:style>
-  <w:style w:type="paragraph" w:styleId="Corpodetexto2">
+  <w:style w:type="paragraph" w:styleId="BodyText2">
     <w:name w:val="Body Text 2"/>
     <w:basedOn w:val="Normal"/>
-    <w:link w:val="Corpodetexto2Char"/>
+    <w:link w:val="BodyText2Char"/>
     <w:rsid w:val="0026455E"/>
     <w:pPr>
       <w:spacing w:after="120" w:line="480" w:lineRule="auto"/>
     </w:pPr>
   </w:style>
-  <w:style w:type="character" w:styleId="Corpodetexto2Char" w:customStyle="1">
-    <w:name w:val="Corpo de texto 2 Char"/>
-    <w:basedOn w:val="Fontepargpadro"/>
-    <w:link w:val="Corpodetexto2"/>
+  <w:style w:type="character" w:customStyle="1" w:styleId="BodyText2Char">
+    <w:name w:val="Body Text 2 Char"/>
+    <w:basedOn w:val="DefaultParagraphFont"/>
+    <w:link w:val="BodyText2"/>
     <w:rsid w:val="0026455E"/>
     <w:rPr>
-      <w:rFonts w:ascii="Times New Roman" w:hAnsi="Times New Roman" w:eastAsia="Times New Roman" w:cs="Times New Roman"/>
+      <w:rFonts w:ascii="Times New Roman" w:eastAsia="Times New Roman" w:hAnsi="Times New Roman" w:cs="Times New Roman"/>
       <w:kern w:val="0"/>
       <w:sz w:val="20"/>
       <w:szCs w:val="20"/>
@@ -3534,7 +3217,7 @@
       <w14:ligatures w14:val="none"/>
     </w:rPr>
   </w:style>
-  <w:style w:type="character" w:styleId="clconteudodados1" w:customStyle="1">
+  <w:style w:type="character" w:customStyle="1" w:styleId="clconteudodados1">
     <w:name w:val="clconteudodados1"/>
     <w:rsid w:val="0026455E"/>
     <w:rPr>
@@ -3542,10 +3225,10 @@
       <w:szCs w:val="23"/>
     </w:rPr>
   </w:style>
-  <w:style w:type="paragraph" w:styleId="Corpodetexto">
+  <w:style w:type="paragraph" w:styleId="BodyText">
     <w:name w:val="Body Text"/>
     <w:basedOn w:val="Normal"/>
-    <w:link w:val="CorpodetextoChar"/>
+    <w:link w:val="BodyTextChar"/>
     <w:uiPriority w:val="99"/>
     <w:semiHidden/>
     <w:unhideWhenUsed/>
@@ -3554,15 +3237,15 @@
       <w:spacing w:after="120"/>
     </w:pPr>
   </w:style>
-  <w:style w:type="character" w:styleId="CorpodetextoChar" w:customStyle="1">
-    <w:name w:val="Corpo de texto Char"/>
-    <w:basedOn w:val="Fontepargpadro"/>
-    <w:link w:val="Corpodetexto"/>
+  <w:style w:type="character" w:customStyle="1" w:styleId="BodyTextChar">
+    <w:name w:val="Body Text Char"/>
+    <w:basedOn w:val="DefaultParagraphFont"/>
+    <w:link w:val="BodyText"/>
     <w:uiPriority w:val="99"/>
     <w:semiHidden/>
     <w:rsid w:val="0026455E"/>
     <w:rPr>
-      <w:rFonts w:ascii="Times New Roman" w:hAnsi="Times New Roman" w:eastAsia="Times New Roman" w:cs="Times New Roman"/>
+      <w:rFonts w:ascii="Times New Roman" w:eastAsia="Times New Roman" w:hAnsi="Times New Roman" w:cs="Times New Roman"/>
       <w:kern w:val="0"/>
       <w:sz w:val="20"/>
       <w:szCs w:val="20"/>
@@ -3570,10 +3253,10 @@
       <w14:ligatures w14:val="none"/>
     </w:rPr>
   </w:style>
-  <w:style w:type="paragraph" w:styleId="Cabealho">
+  <w:style w:type="paragraph" w:styleId="Header">
     <w:name w:val="header"/>
     <w:basedOn w:val="Normal"/>
-    <w:link w:val="CabealhoChar"/>
+    <w:link w:val="HeaderChar"/>
     <w:rsid w:val="0026455E"/>
     <w:pPr>
       <w:tabs>
@@ -3582,13 +3265,13 @@
       </w:tabs>
     </w:pPr>
   </w:style>
-  <w:style w:type="character" w:styleId="CabealhoChar" w:customStyle="1">
-    <w:name w:val="Cabeçalho Char"/>
-    <w:basedOn w:val="Fontepargpadro"/>
-    <w:link w:val="Cabealho"/>
+  <w:style w:type="character" w:customStyle="1" w:styleId="HeaderChar">
+    <w:name w:val="Header Char"/>
+    <w:basedOn w:val="DefaultParagraphFont"/>
+    <w:link w:val="Header"/>
     <w:rsid w:val="0026455E"/>
     <w:rPr>
-      <w:rFonts w:ascii="Times New Roman" w:hAnsi="Times New Roman" w:eastAsia="Times New Roman" w:cs="Times New Roman"/>
+      <w:rFonts w:ascii="Times New Roman" w:eastAsia="Times New Roman" w:hAnsi="Times New Roman" w:cs="Times New Roman"/>
       <w:kern w:val="0"/>
       <w:sz w:val="20"/>
       <w:szCs w:val="20"/>
@@ -3600,7 +3283,7 @@
 </file>
 
 <file path=word/theme/theme1.xml><?xml version="1.0" encoding="utf-8"?>
-<a:theme xmlns:a="http://schemas.openxmlformats.org/drawingml/2006/main" xmlns:thm15="http://schemas.microsoft.com/office/thememl/2012/main" name="Tema do Office">
+<a:theme xmlns:a="http://schemas.openxmlformats.org/drawingml/2006/main" name="Tema do Office">
   <a:themeElements>
     <a:clrScheme name="Office">
       <a:dk1>
@@ -3895,6 +3578,26 @@
 </file>
 
 <file path=customXml/item1.xml><?xml version="1.0" encoding="utf-8"?>
+<p:properties xmlns:p="http://schemas.microsoft.com/office/2006/metadata/properties" xmlns:xsi="http://www.w3.org/2001/XMLSchema-instance" xmlns:pc="http://schemas.microsoft.com/office/infopath/2007/PartnerControls">
+  <documentManagement>
+    <lcf76f155ced4ddcb4097134ff3c332f xmlns="45d87653-87d8-494c-8e49-088800f3b2bc">
+      <Terms xmlns="http://schemas.microsoft.com/office/infopath/2007/PartnerControls"/>
+    </lcf76f155ced4ddcb4097134ff3c332f>
+    <TaxCatchAll xmlns="7f4487f1-01bf-436b-8bcd-221dd2c466b1" xsi:nil="true"/>
+  </documentManagement>
+</p:properties>
+</file>
+
+<file path=customXml/item2.xml><?xml version="1.0" encoding="utf-8"?>
+<?mso-contentType ?>
+<FormTemplates xmlns="http://schemas.microsoft.com/sharepoint/v3/contenttype/forms">
+  <Display>DocumentLibraryForm</Display>
+  <Edit>DocumentLibraryForm</Edit>
+  <New>DocumentLibraryForm</New>
+</FormTemplates>
+</file>
+
+<file path=customXml/item3.xml><?xml version="1.0" encoding="utf-8"?>
 <ct:contentTypeSchema xmlns:ct="http://schemas.microsoft.com/office/2006/metadata/contentType" xmlns:ma="http://schemas.microsoft.com/office/2006/metadata/properties/metaAttributes" ct:_="" ma:_="" ma:contentTypeName="Documento" ma:contentTypeID="0x01010016FDE3C6424605428A31B69286ADC0A6" ma:contentTypeVersion="13" ma:contentTypeDescription="Crie um novo documento." ma:contentTypeScope="" ma:versionID="a564b86eced251aa010ac88f39c48d39">
   <xsd:schema xmlns:xsd="http://www.w3.org/2001/XMLSchema" xmlns:xs="http://www.w3.org/2001/XMLSchema" xmlns:p="http://schemas.microsoft.com/office/2006/metadata/properties" xmlns:ns2="45d87653-87d8-494c-8e49-088800f3b2bc" xmlns:ns3="7f4487f1-01bf-436b-8bcd-221dd2c466b1" targetNamespace="http://schemas.microsoft.com/office/2006/metadata/properties" ma:root="true" ma:fieldsID="5052c753b227970124821557e25c9be6" ns2:_="" ns3:_="">
     <xsd:import namespace="45d87653-87d8-494c-8e49-088800f3b2bc"/>
@@ -4117,34 +3820,40 @@
 </ct:contentTypeSchema>
 </file>
 
-<file path=customXml/item2.xml><?xml version="1.0" encoding="utf-8"?>
-<?mso-contentType ?>
-<FormTemplates xmlns="http://schemas.microsoft.com/sharepoint/v3/contenttype/forms">
-  <Display>DocumentLibraryForm</Display>
-  <Edit>DocumentLibraryForm</Edit>
-  <New>DocumentLibraryForm</New>
-</FormTemplates>
-</file>
-
-<file path=customXml/item3.xml><?xml version="1.0" encoding="utf-8"?>
-<p:properties xmlns:p="http://schemas.microsoft.com/office/2006/metadata/properties" xmlns:xsi="http://www.w3.org/2001/XMLSchema-instance" xmlns:pc="http://schemas.microsoft.com/office/infopath/2007/PartnerControls">
-  <documentManagement>
-    <lcf76f155ced4ddcb4097134ff3c332f xmlns="45d87653-87d8-494c-8e49-088800f3b2bc">
-      <Terms xmlns="http://schemas.microsoft.com/office/infopath/2007/PartnerControls"/>
-    </lcf76f155ced4ddcb4097134ff3c332f>
-    <TaxCatchAll xmlns="7f4487f1-01bf-436b-8bcd-221dd2c466b1" xsi:nil="true"/>
-  </documentManagement>
-</p:properties>
-</file>
-
 <file path=customXml/itemProps1.xml><?xml version="1.0" encoding="utf-8"?>
-<ds:datastoreItem xmlns:ds="http://schemas.openxmlformats.org/officeDocument/2006/customXml" ds:itemID="{CDE4A3E0-169A-49B8-880F-8E5646147731}"/>
+<ds:datastoreItem xmlns:ds="http://schemas.openxmlformats.org/officeDocument/2006/customXml" ds:itemID="{90985B78-A5F2-4A12-BE3A-7C4F5F09013F}">
+  <ds:schemaRefs>
+    <ds:schemaRef ds:uri="http://schemas.microsoft.com/office/2006/metadata/properties"/>
+    <ds:schemaRef ds:uri="http://schemas.microsoft.com/office/infopath/2007/PartnerControls"/>
+    <ds:schemaRef ds:uri="45d87653-87d8-494c-8e49-088800f3b2bc"/>
+    <ds:schemaRef ds:uri="7f4487f1-01bf-436b-8bcd-221dd2c466b1"/>
+  </ds:schemaRefs>
+</ds:datastoreItem>
 </file>
 
 <file path=customXml/itemProps2.xml><?xml version="1.0" encoding="utf-8"?>
-<ds:datastoreItem xmlns:ds="http://schemas.openxmlformats.org/officeDocument/2006/customXml" ds:itemID="{A4F9D0FE-5CEE-4F56-AB2F-8B328338CAF9}"/>
+<ds:datastoreItem xmlns:ds="http://schemas.openxmlformats.org/officeDocument/2006/customXml" ds:itemID="{A4F9D0FE-5CEE-4F56-AB2F-8B328338CAF9}">
+  <ds:schemaRefs>
+    <ds:schemaRef ds:uri="http://schemas.microsoft.com/sharepoint/v3/contenttype/forms"/>
+  </ds:schemaRefs>
+</ds:datastoreItem>
 </file>
 
 <file path=customXml/itemProps3.xml><?xml version="1.0" encoding="utf-8"?>
-<ds:datastoreItem xmlns:ds="http://schemas.openxmlformats.org/officeDocument/2006/customXml" ds:itemID="{90985B78-A5F2-4A12-BE3A-7C4F5F09013F}"/>
+<ds:datastoreItem xmlns:ds="http://schemas.openxmlformats.org/officeDocument/2006/customXml" ds:itemID="{CDE4A3E0-169A-49B8-880F-8E5646147731}">
+  <ds:schemaRefs>
+    <ds:schemaRef ds:uri="http://schemas.microsoft.com/office/2006/metadata/contentType"/>
+    <ds:schemaRef ds:uri="http://schemas.microsoft.com/office/2006/metadata/properties/metaAttributes"/>
+    <ds:schemaRef ds:uri="http://www.w3.org/2001/XMLSchema"/>
+    <ds:schemaRef ds:uri="http://schemas.microsoft.com/office/2006/metadata/properties"/>
+    <ds:schemaRef ds:uri="45d87653-87d8-494c-8e49-088800f3b2bc"/>
+    <ds:schemaRef ds:uri="7f4487f1-01bf-436b-8bcd-221dd2c466b1"/>
+    <ds:schemaRef ds:uri="http://schemas.microsoft.com/office/2006/documentManagement/types"/>
+    <ds:schemaRef ds:uri="http://schemas.microsoft.com/office/infopath/2007/PartnerControls"/>
+    <ds:schemaRef ds:uri="http://schemas.openxmlformats.org/package/2006/metadata/core-properties"/>
+    <ds:schemaRef ds:uri="http://purl.org/dc/elements/1.1/"/>
+    <ds:schemaRef ds:uri="http://purl.org/dc/terms/"/>
+    <ds:schemaRef ds:uri="http://schemas.microsoft.com/internal/obd"/>
+  </ds:schemaRefs>
+</ds:datastoreItem>
 </file>
</xml_diff>

<commit_message>
fix: corrige preenchimento do template DOCX, remove PDF e ajusta formatação de CPF/CEP
</commit_message>
<xml_diff>
--- a/public/template.docx
+++ b/public/template.docx
@@ -420,7 +420,7 @@
           <w:sz w:val="18"/>
           <w:szCs w:val="18"/>
         </w:rPr>
-        <w:t>SISBSU</w:t>
+        <w:t>{CODIGO_LOCALIZADOR}</w:t>
       </w:r>
     </w:p>
     <w:p>
@@ -452,7 +452,7 @@
           <w:sz w:val="18"/>
           <w:szCs w:val="18"/>
         </w:rPr>
-        <w:t>POAG360019</w:t>
+        <w:t>{RELATORIO_DANO}</w:t>
       </w:r>
     </w:p>
     <w:p>
@@ -517,7 +517,7 @@
           <w:sz w:val="18"/>
           <w:szCs w:val="18"/>
         </w:rPr>
-        <w:t>JULIANA ALMEIDA</w:t>
+        <w:t>{NOME_CLIENTE}</w:t>
       </w:r>
       <w:r>
         <w:rPr>
@@ -546,7 +546,7 @@
           <w:sz w:val="18"/>
           <w:szCs w:val="18"/>
         </w:rPr>
-        <w:t>12345678900</w:t>
+        <w:t>{CPF_CLIENTE}</w:t>
       </w:r>
       <w:r>
         <w:rPr>
@@ -572,7 +572,7 @@
           <w:sz w:val="18"/>
           <w:szCs w:val="18"/>
         </w:rPr>
-        <w:t>AV SAO JOSE MARIA ESCRIVA 560 BLOCO 11611</w:t>
+        <w:t>{ENDERECO}</w:t>
       </w:r>
       <w:r>
         <w:rPr>
@@ -592,7 +592,7 @@
           <w:sz w:val="18"/>
           <w:szCs w:val="18"/>
         </w:rPr>
-        <w:t>22753-200</w:t>
+        <w:t>{CEP}</w:t>
       </w:r>
       <w:r>
         <w:rPr>
@@ -612,7 +612,7 @@
           <w:sz w:val="18"/>
           <w:szCs w:val="18"/>
         </w:rPr>
-        <w:t>COSTA E SILVA</w:t>
+        <w:t>{BAIRRO}</w:t>
       </w:r>
       <w:r>
         <w:rPr>
@@ -632,7 +632,7 @@
           <w:sz w:val="18"/>
           <w:szCs w:val="18"/>
         </w:rPr>
-        <w:t>PORTO ALEGRE/RS</w:t>
+        <w:t>{CIDADE_UF}</w:t>
       </w:r>
       <w:r>
         <w:rPr>
@@ -704,7 +704,7 @@
           <w:sz w:val="18"/>
           <w:szCs w:val="18"/>
         </w:rPr>
-        <w:t>JULIANA ALMEIDA</w:t>
+        <w:t>{NOME_CLIENTE}</w:t>
       </w:r>
       <w:r>
         <w:rPr>
@@ -740,7 +740,7 @@
           <w:sz w:val="18"/>
           <w:szCs w:val="18"/>
         </w:rPr>
-        <w:t>123456789</w:t>
+        <w:t>{NUMERO_SMILES}</w:t>
       </w:r>
       <w:r>
         <w:rPr>
@@ -879,7 +879,7 @@
           <w:sz w:val="18"/>
           <w:szCs w:val="18"/>
         </w:rPr>
-        <w:t>12345678900</w:t>
+        <w:t>{CPF_CLIENTE}</w:t>
       </w:r>
       <w:r>
         <w:rPr>
@@ -1354,7 +1354,7 @@
           <w:sz w:val="18"/>
           <w:szCs w:val="18"/>
         </w:rPr>
-        <w:t>JULIANA ALMEIDA</w:t>
+        <w:t>{NOME_CLIENTE}</w:t>
       </w:r>
       <w:r>
         <w:rPr>
@@ -1407,7 +1407,7 @@
           <w:szCs w:val="18"/>
           <w:lang w:val="es-ES"/>
         </w:rPr>
-        <w:t>PORTO ALEGRE/RS,1</w:t>
+        <w:t>{CIDADE_UF},1</w:t>
       </w:r>
       <w:r>
         <w:rPr>

</xml_diff>

<commit_message>
fix: corrige template do docx para milhas e data usando regex robusta para XML
</commit_message>
<xml_diff>
--- a/public/template.docx
+++ b/public/template.docx
@@ -767,29 +767,7 @@
           <w:sz w:val="18"/>
           <w:szCs w:val="18"/>
         </w:rPr>
-        <w:t>2</w:t>
-      </w:r>
-      <w:r>
-        <w:rPr>
-          <w:rStyle w:val="clconteudodados1"/>
-          <w:rFonts w:ascii="Arial" w:eastAsiaTheme="majorEastAsia" w:hAnsi="Arial" w:cs="Arial"/>
-          <w:b/>
-          <w:bCs/>
-          <w:sz w:val="18"/>
-          <w:szCs w:val="18"/>
-        </w:rPr>
-        <w:t>5</w:t>
-      </w:r>
-      <w:r>
-        <w:rPr>
-          <w:rStyle w:val="clconteudodados1"/>
-          <w:rFonts w:ascii="Arial" w:eastAsiaTheme="majorEastAsia" w:hAnsi="Arial" w:cs="Arial"/>
-          <w:b/>
-          <w:bCs/>
-          <w:sz w:val="18"/>
-          <w:szCs w:val="18"/>
-        </w:rPr>
-        <w:t>.000</w:t>
+        <w:t>{QUANTIDADE_MILHAS}</w:t>
       </w:r>
       <w:r>
         <w:rPr>
@@ -1407,25 +1385,7 @@
           <w:szCs w:val="18"/>
           <w:lang w:val="es-ES"/>
         </w:rPr>
-        <w:t>{CIDADE_UF},1</w:t>
-      </w:r>
-      <w:r>
-        <w:rPr>
-          <w:rFonts w:ascii="Arial" w:hAnsi="Arial" w:cs="Arial"/>
-          <w:sz w:val="18"/>
-          <w:szCs w:val="18"/>
-          <w:lang w:val="es-ES"/>
-        </w:rPr>
-        <w:t>9</w:t>
-      </w:r>
-      <w:r>
-        <w:rPr>
-          <w:rFonts w:ascii="Arial" w:hAnsi="Arial" w:cs="Arial"/>
-          <w:sz w:val="18"/>
-          <w:szCs w:val="18"/>
-          <w:lang w:val="es-ES"/>
-        </w:rPr>
-        <w:t xml:space="preserve"> DE ABRIL DE 2026</w:t>
+        <w:t>{CIDADE_UF},{DATA_EXTENSO}</w:t>
       </w:r>
     </w:p>
     <w:p>

</xml_diff>